<commit_message>
Rest assured day 1 java
</commit_message>
<xml_diff>
--- a/RestAssuredNotesIsha.docx
+++ b/RestAssuredNotesIsha.docx
@@ -5,21 +5,72 @@
     <w:p>
       <w:pPr>
         <w:jc w:val="center"/>
-      </w:pPr>
-      <w:r>
-        <w:rPr>
+        <w:rPr>
+          <w:rFonts w:ascii="Calibri" w:hAnsi="Calibri" w:cs="Calibri"/>
           <w:b/>
           <w:bCs/>
           <w:sz w:val="28"/>
           <w:szCs w:val="28"/>
         </w:rPr>
+      </w:pPr>
+      <w:r>
+        <w:rPr>
+          <w:rFonts w:ascii="Calibri" w:hAnsi="Calibri" w:cs="Calibri"/>
+          <w:b/>
+          <w:bCs/>
+          <w:sz w:val="28"/>
+          <w:szCs w:val="28"/>
+        </w:rPr>
         <w:t>REST ASSURED AUTOMATION</w:t>
       </w:r>
-      <w:r>
+    </w:p>
+    <w:p>
+      <w:pPr>
+        <w:rPr>
+          <w:rFonts w:ascii="Calibri" w:hAnsi="Calibri" w:cs="Calibri"/>
+          <w:b/>
+          <w:bCs/>
+          <w:sz w:val="28"/>
+          <w:szCs w:val="28"/>
+        </w:rPr>
+      </w:pPr>
+    </w:p>
+    <w:p>
+      <w:pPr>
+        <w:rPr>
+          <w:rFonts w:ascii="Calibri" w:hAnsi="Calibri" w:cs="Calibri"/>
+          <w:b/>
+          <w:bCs/>
+        </w:rPr>
+      </w:pPr>
+      <w:r>
+        <w:rPr>
+          <w:rFonts w:ascii="Calibri" w:hAnsi="Calibri" w:cs="Calibri"/>
+          <w:b/>
+          <w:bCs/>
+        </w:rPr>
+        <w:t>COURSE CONTENTS:</w:t>
+      </w:r>
+    </w:p>
+    <w:p>
+      <w:pPr>
+        <w:rPr>
+          <w:rFonts w:ascii="Calibri" w:hAnsi="Calibri" w:cs="Calibri"/>
+          <w:b/>
+          <w:bCs/>
+        </w:rPr>
+      </w:pPr>
+      <w:r>
+        <w:rPr>
+          <w:rFonts w:ascii="Calibri" w:hAnsi="Calibri" w:cs="Calibri"/>
+          <w:b/>
+          <w:bCs/>
+          <w:noProof/>
+        </w:rPr>
         <w:drawing>
-          <wp:inline distT="0" distB="0" distL="0" distR="0" wp14:anchorId="1D51F31F" wp14:editId="6B9C062F">
-            <wp:extent cx="5731510" cy="3974465"/>
-            <wp:effectExtent l="0" t="0" r="2540" b="6985"/>
+          <wp:inline distT="0" distB="0" distL="0" distR="0" wp14:anchorId="1D51F31F" wp14:editId="73860AD3">
+            <wp:extent cx="2353901" cy="1632293"/>
+            <wp:effectExtent l="0" t="0" r="8890" b="6350"/>
             <wp:docPr id="266248582" name="Picture 1"/>
             <wp:cNvGraphicFramePr>
               <a:graphicFrameLocks xmlns:a="http://schemas.openxmlformats.org/drawingml/2006/main" noChangeAspect="1"/>
@@ -40,7 +91,7 @@
                   <pic:spPr>
                     <a:xfrm>
                       <a:off x="0" y="0"/>
-                      <a:ext cx="5731510" cy="3974465"/>
+                      <a:ext cx="2382198" cy="1651915"/>
                     </a:xfrm>
                     <a:prstGeom prst="rect">
                       <a:avLst/>
@@ -52,13 +103,25 @@
           </wp:inline>
         </w:drawing>
       </w:r>
-    </w:p>
-    <w:p>
-      <w:r>
+      <w:r>
+        <w:rPr>
+          <w:rFonts w:ascii="Calibri" w:hAnsi="Calibri" w:cs="Calibri"/>
+          <w:b/>
+          <w:bCs/>
+        </w:rPr>
+        <w:t xml:space="preserve"> </w:t>
+      </w:r>
+      <w:r>
+        <w:rPr>
+          <w:rFonts w:ascii="Calibri" w:hAnsi="Calibri" w:cs="Calibri"/>
+          <w:b/>
+          <w:bCs/>
+          <w:noProof/>
+        </w:rPr>
         <w:drawing>
-          <wp:inline distT="0" distB="0" distL="0" distR="0" wp14:anchorId="2C5B5C1B" wp14:editId="7F322CF1">
-            <wp:extent cx="5731510" cy="4087495"/>
-            <wp:effectExtent l="0" t="0" r="2540" b="8255"/>
+          <wp:inline distT="0" distB="0" distL="0" distR="0" wp14:anchorId="1969D9E2" wp14:editId="0CD8677B">
+            <wp:extent cx="2267893" cy="1617375"/>
+            <wp:effectExtent l="0" t="0" r="0" b="1905"/>
             <wp:docPr id="1860044553" name="Picture 1" descr="A blue rectangular box with white text&#10;&#10;AI-generated content may be incorrect."/>
             <wp:cNvGraphicFramePr>
               <a:graphicFrameLocks xmlns:a="http://schemas.openxmlformats.org/drawingml/2006/main" noChangeAspect="1"/>
@@ -79,7 +142,7 @@
                   <pic:spPr>
                     <a:xfrm>
                       <a:off x="0" y="0"/>
-                      <a:ext cx="5731510" cy="4087495"/>
+                      <a:ext cx="2278126" cy="1624673"/>
                     </a:xfrm>
                     <a:prstGeom prst="rect">
                       <a:avLst/>
@@ -93,12 +156,24 @@
       </w:r>
     </w:p>
     <w:p>
-      <w:r>
-        <w:lastRenderedPageBreak/>
+      <w:pPr>
+        <w:rPr>
+          <w:rFonts w:ascii="Calibri" w:hAnsi="Calibri" w:cs="Calibri"/>
+          <w:b/>
+          <w:bCs/>
+        </w:rPr>
+      </w:pPr>
+      <w:r>
+        <w:rPr>
+          <w:rFonts w:ascii="Calibri" w:hAnsi="Calibri" w:cs="Calibri"/>
+          <w:b/>
+          <w:bCs/>
+          <w:noProof/>
+        </w:rPr>
         <w:drawing>
-          <wp:inline distT="0" distB="0" distL="0" distR="0" wp14:anchorId="4227B249" wp14:editId="0E778CF9">
-            <wp:extent cx="5731510" cy="3800475"/>
-            <wp:effectExtent l="0" t="0" r="2540" b="9525"/>
+          <wp:inline distT="0" distB="0" distL="0" distR="0" wp14:anchorId="4227B249" wp14:editId="45F09A3E">
+            <wp:extent cx="2444436" cy="1620868"/>
+            <wp:effectExtent l="0" t="0" r="0" b="0"/>
             <wp:docPr id="1192801623" name="Picture 1" descr="A blue rectangular object with white text&#10;&#10;AI-generated content may be incorrect."/>
             <wp:cNvGraphicFramePr>
               <a:graphicFrameLocks xmlns:a="http://schemas.openxmlformats.org/drawingml/2006/main" noChangeAspect="1"/>
@@ -119,7 +194,7 @@
                   <pic:spPr>
                     <a:xfrm>
                       <a:off x="0" y="0"/>
-                      <a:ext cx="5731510" cy="3800475"/>
+                      <a:ext cx="2463214" cy="1633320"/>
                     </a:xfrm>
                     <a:prstGeom prst="rect">
                       <a:avLst/>
@@ -131,13 +206,17 @@
           </wp:inline>
         </w:drawing>
       </w:r>
-    </w:p>
-    <w:p>
-      <w:r>
+      <w:r>
+        <w:rPr>
+          <w:rFonts w:ascii="Calibri" w:hAnsi="Calibri" w:cs="Calibri"/>
+          <w:b/>
+          <w:bCs/>
+          <w:noProof/>
+        </w:rPr>
         <w:drawing>
-          <wp:inline distT="0" distB="0" distL="0" distR="0" wp14:anchorId="6DABECAF" wp14:editId="5A3649E8">
-            <wp:extent cx="5731510" cy="3656330"/>
-            <wp:effectExtent l="0" t="0" r="2540" b="1270"/>
+          <wp:inline distT="0" distB="0" distL="0" distR="0" wp14:anchorId="6DABECAF" wp14:editId="42AF4CCC">
+            <wp:extent cx="2326740" cy="1484309"/>
+            <wp:effectExtent l="0" t="0" r="0" b="1905"/>
             <wp:docPr id="441159697" name="Picture 1" descr="A blue rectangular box with white text&#10;&#10;AI-generated content may be incorrect."/>
             <wp:cNvGraphicFramePr>
               <a:graphicFrameLocks xmlns:a="http://schemas.openxmlformats.org/drawingml/2006/main" noChangeAspect="1"/>
@@ -158,7 +237,7 @@
                   <pic:spPr>
                     <a:xfrm>
                       <a:off x="0" y="0"/>
-                      <a:ext cx="5731510" cy="3656330"/>
+                      <a:ext cx="2347732" cy="1497701"/>
                     </a:xfrm>
                     <a:prstGeom prst="rect">
                       <a:avLst/>
@@ -172,12 +251,24 @@
       </w:r>
     </w:p>
     <w:p>
-      <w:r>
-        <w:lastRenderedPageBreak/>
+      <w:pPr>
+        <w:rPr>
+          <w:rFonts w:ascii="Calibri" w:hAnsi="Calibri" w:cs="Calibri"/>
+          <w:b/>
+          <w:bCs/>
+        </w:rPr>
+      </w:pPr>
+      <w:r>
+        <w:rPr>
+          <w:rFonts w:ascii="Calibri" w:hAnsi="Calibri" w:cs="Calibri"/>
+          <w:b/>
+          <w:bCs/>
+          <w:noProof/>
+        </w:rPr>
         <w:drawing>
-          <wp:inline distT="0" distB="0" distL="0" distR="0" wp14:anchorId="11B1AF3C" wp14:editId="7DF045E8">
-            <wp:extent cx="5731510" cy="4022725"/>
-            <wp:effectExtent l="0" t="0" r="2540" b="0"/>
+          <wp:inline distT="0" distB="0" distL="0" distR="0" wp14:anchorId="11B1AF3C" wp14:editId="1CA1F0FC">
+            <wp:extent cx="2467069" cy="1731540"/>
+            <wp:effectExtent l="0" t="0" r="0" b="2540"/>
             <wp:docPr id="1918238769" name="Picture 1" descr="A blue rectangular sign with white text&#10;&#10;AI-generated content may be incorrect."/>
             <wp:cNvGraphicFramePr>
               <a:graphicFrameLocks xmlns:a="http://schemas.openxmlformats.org/drawingml/2006/main" noChangeAspect="1"/>
@@ -198,7 +289,7 @@
                   <pic:spPr>
                     <a:xfrm>
                       <a:off x="0" y="0"/>
-                      <a:ext cx="5731510" cy="4022725"/>
+                      <a:ext cx="2483076" cy="1742774"/>
                     </a:xfrm>
                     <a:prstGeom prst="rect">
                       <a:avLst/>
@@ -210,13 +301,17 @@
           </wp:inline>
         </w:drawing>
       </w:r>
-    </w:p>
-    <w:p>
-      <w:r>
+      <w:r>
+        <w:rPr>
+          <w:rFonts w:ascii="Calibri" w:hAnsi="Calibri" w:cs="Calibri"/>
+          <w:b/>
+          <w:bCs/>
+          <w:noProof/>
+        </w:rPr>
         <w:drawing>
-          <wp:inline distT="0" distB="0" distL="0" distR="0" wp14:anchorId="0A76275A" wp14:editId="18C8C29D">
-            <wp:extent cx="5731510" cy="4053840"/>
-            <wp:effectExtent l="0" t="0" r="2540" b="3810"/>
+          <wp:inline distT="0" distB="0" distL="0" distR="0" wp14:anchorId="0A76275A" wp14:editId="198D0630">
+            <wp:extent cx="2290527" cy="1620066"/>
+            <wp:effectExtent l="0" t="0" r="0" b="0"/>
             <wp:docPr id="1835658198" name="Picture 1" descr="A blue rectangular sign with white text&#10;&#10;AI-generated content may be incorrect."/>
             <wp:cNvGraphicFramePr>
               <a:graphicFrameLocks xmlns:a="http://schemas.openxmlformats.org/drawingml/2006/main" noChangeAspect="1"/>
@@ -237,7 +332,7 @@
                   <pic:spPr>
                     <a:xfrm>
                       <a:off x="0" y="0"/>
-                      <a:ext cx="5731510" cy="4053840"/>
+                      <a:ext cx="2309550" cy="1633521"/>
                     </a:xfrm>
                     <a:prstGeom prst="rect">
                       <a:avLst/>
@@ -251,12 +346,24 @@
       </w:r>
     </w:p>
     <w:p>
-      <w:r>
-        <w:lastRenderedPageBreak/>
+      <w:pPr>
+        <w:rPr>
+          <w:rFonts w:ascii="Calibri" w:hAnsi="Calibri" w:cs="Calibri"/>
+          <w:b/>
+          <w:bCs/>
+        </w:rPr>
+      </w:pPr>
+      <w:r>
+        <w:rPr>
+          <w:rFonts w:ascii="Calibri" w:hAnsi="Calibri" w:cs="Calibri"/>
+          <w:b/>
+          <w:bCs/>
+          <w:noProof/>
+        </w:rPr>
         <w:drawing>
-          <wp:inline distT="0" distB="0" distL="0" distR="0" wp14:anchorId="019C879F" wp14:editId="6285E2F2">
-            <wp:extent cx="5731510" cy="3866515"/>
-            <wp:effectExtent l="0" t="0" r="2540" b="635"/>
+          <wp:inline distT="0" distB="0" distL="0" distR="0" wp14:anchorId="019C879F" wp14:editId="223C337E">
+            <wp:extent cx="2394642" cy="1615441"/>
+            <wp:effectExtent l="0" t="0" r="5715" b="3810"/>
             <wp:docPr id="1902797736" name="Picture 1" descr="A blue rectangular object with white text&#10;&#10;AI-generated content may be incorrect."/>
             <wp:cNvGraphicFramePr>
               <a:graphicFrameLocks xmlns:a="http://schemas.openxmlformats.org/drawingml/2006/main" noChangeAspect="1"/>
@@ -277,7 +384,7 @@
                   <pic:spPr>
                     <a:xfrm>
                       <a:off x="0" y="0"/>
-                      <a:ext cx="5731510" cy="3866515"/>
+                      <a:ext cx="2402494" cy="1620738"/>
                     </a:xfrm>
                     <a:prstGeom prst="rect">
                       <a:avLst/>
@@ -289,13 +396,17 @@
           </wp:inline>
         </w:drawing>
       </w:r>
-    </w:p>
-    <w:p>
-      <w:r>
+      <w:r>
+        <w:rPr>
+          <w:rFonts w:ascii="Calibri" w:hAnsi="Calibri" w:cs="Calibri"/>
+          <w:b/>
+          <w:bCs/>
+          <w:noProof/>
+        </w:rPr>
         <w:drawing>
-          <wp:inline distT="0" distB="0" distL="0" distR="0" wp14:anchorId="790D388C" wp14:editId="16F0C891">
-            <wp:extent cx="5731510" cy="3730625"/>
-            <wp:effectExtent l="0" t="0" r="2540" b="3175"/>
+          <wp:inline distT="0" distB="0" distL="0" distR="0" wp14:anchorId="790D388C" wp14:editId="05D09595">
+            <wp:extent cx="2788467" cy="1815006"/>
+            <wp:effectExtent l="0" t="0" r="0" b="0"/>
             <wp:docPr id="811110673" name="Picture 1" descr="A blue and white rectangular box with white text&#10;&#10;AI-generated content may be incorrect."/>
             <wp:cNvGraphicFramePr>
               <a:graphicFrameLocks xmlns:a="http://schemas.openxmlformats.org/drawingml/2006/main" noChangeAspect="1"/>
@@ -316,7 +427,7 @@
                   <pic:spPr>
                     <a:xfrm>
                       <a:off x="0" y="0"/>
-                      <a:ext cx="5731510" cy="3730625"/>
+                      <a:ext cx="2797459" cy="1820859"/>
                     </a:xfrm>
                     <a:prstGeom prst="rect">
                       <a:avLst/>
@@ -330,12 +441,25 @@
       </w:r>
     </w:p>
     <w:p>
-      <w:r>
+      <w:pPr>
+        <w:rPr>
+          <w:rFonts w:ascii="Calibri" w:hAnsi="Calibri" w:cs="Calibri"/>
+          <w:b/>
+          <w:bCs/>
+        </w:rPr>
+      </w:pPr>
+      <w:r>
+        <w:rPr>
+          <w:rFonts w:ascii="Calibri" w:hAnsi="Calibri" w:cs="Calibri"/>
+          <w:b/>
+          <w:bCs/>
+          <w:noProof/>
+        </w:rPr>
         <w:lastRenderedPageBreak/>
         <w:drawing>
-          <wp:inline distT="0" distB="0" distL="0" distR="0" wp14:anchorId="00FC0863" wp14:editId="03D84CDE">
-            <wp:extent cx="5731510" cy="3850640"/>
-            <wp:effectExtent l="0" t="0" r="2540" b="0"/>
+          <wp:inline distT="0" distB="0" distL="0" distR="0" wp14:anchorId="00FC0863" wp14:editId="79FF8A1F">
+            <wp:extent cx="2728828" cy="1833327"/>
+            <wp:effectExtent l="0" t="0" r="0" b="0"/>
             <wp:docPr id="1538494207" name="Picture 1" descr="A white card with blue text&#10;&#10;AI-generated content may be incorrect."/>
             <wp:cNvGraphicFramePr>
               <a:graphicFrameLocks xmlns:a="http://schemas.openxmlformats.org/drawingml/2006/main" noChangeAspect="1"/>
@@ -356,7 +480,7 @@
                   <pic:spPr>
                     <a:xfrm>
                       <a:off x="0" y="0"/>
-                      <a:ext cx="5731510" cy="3850640"/>
+                      <a:ext cx="2743903" cy="1843455"/>
                     </a:xfrm>
                     <a:prstGeom prst="rect">
                       <a:avLst/>
@@ -368,13 +492,26 @@
           </wp:inline>
         </w:drawing>
       </w:r>
-    </w:p>
-    <w:p>
-      <w:r>
+      <w:r>
+        <w:rPr>
+          <w:rFonts w:ascii="Calibri" w:hAnsi="Calibri" w:cs="Calibri"/>
+          <w:b/>
+          <w:bCs/>
+          <w:noProof/>
+        </w:rPr>
+        <w:t xml:space="preserve">      </w:t>
+      </w:r>
+      <w:r>
+        <w:rPr>
+          <w:rFonts w:ascii="Calibri" w:hAnsi="Calibri" w:cs="Calibri"/>
+          <w:b/>
+          <w:bCs/>
+          <w:noProof/>
+        </w:rPr>
         <w:drawing>
-          <wp:inline distT="0" distB="0" distL="0" distR="0" wp14:anchorId="4AF5AFDF" wp14:editId="574BE641">
-            <wp:extent cx="5601482" cy="4391638"/>
-            <wp:effectExtent l="0" t="0" r="0" b="9525"/>
+          <wp:inline distT="0" distB="0" distL="0" distR="0" wp14:anchorId="4AF5AFDF" wp14:editId="6631EA3C">
+            <wp:extent cx="2263366" cy="1774511"/>
+            <wp:effectExtent l="0" t="0" r="3810" b="0"/>
             <wp:docPr id="554489448" name="Picture 1" descr="A screenshot of a postman&#10;&#10;AI-generated content may be incorrect."/>
             <wp:cNvGraphicFramePr>
               <a:graphicFrameLocks xmlns:a="http://schemas.openxmlformats.org/drawingml/2006/main" noChangeAspect="1"/>
@@ -395,7 +532,7 @@
                   <pic:spPr>
                     <a:xfrm>
                       <a:off x="0" y="0"/>
-                      <a:ext cx="5601482" cy="4391638"/>
+                      <a:ext cx="2276826" cy="1785064"/>
                     </a:xfrm>
                     <a:prstGeom prst="rect">
                       <a:avLst/>
@@ -409,12 +546,24 @@
       </w:r>
     </w:p>
     <w:p>
-      <w:r>
-        <w:lastRenderedPageBreak/>
+      <w:pPr>
+        <w:rPr>
+          <w:rFonts w:ascii="Calibri" w:hAnsi="Calibri" w:cs="Calibri"/>
+          <w:b/>
+          <w:bCs/>
+        </w:rPr>
+      </w:pPr>
+      <w:r>
+        <w:rPr>
+          <w:rFonts w:ascii="Calibri" w:hAnsi="Calibri" w:cs="Calibri"/>
+          <w:b/>
+          <w:bCs/>
+          <w:noProof/>
+        </w:rPr>
         <w:drawing>
-          <wp:inline distT="0" distB="0" distL="0" distR="0" wp14:anchorId="6C0FB672" wp14:editId="203D18C6">
-            <wp:extent cx="5731510" cy="3580765"/>
-            <wp:effectExtent l="0" t="0" r="2540" b="635"/>
+          <wp:inline distT="0" distB="0" distL="0" distR="0" wp14:anchorId="6C0FB672" wp14:editId="0FB2AB9B">
+            <wp:extent cx="2231665" cy="1394234"/>
+            <wp:effectExtent l="0" t="0" r="0" b="0"/>
             <wp:docPr id="905014381" name="Picture 1" descr="A white box with text on it&#10;&#10;AI-generated content may be incorrect."/>
             <wp:cNvGraphicFramePr>
               <a:graphicFrameLocks xmlns:a="http://schemas.openxmlformats.org/drawingml/2006/main" noChangeAspect="1"/>
@@ -435,7 +584,7 @@
                   <pic:spPr>
                     <a:xfrm>
                       <a:off x="0" y="0"/>
-                      <a:ext cx="5731510" cy="3580765"/>
+                      <a:ext cx="2244997" cy="1402563"/>
                     </a:xfrm>
                     <a:prstGeom prst="rect">
                       <a:avLst/>
@@ -447,13 +596,26 @@
           </wp:inline>
         </w:drawing>
       </w:r>
-    </w:p>
-    <w:p>
-      <w:r>
+      <w:r>
+        <w:rPr>
+          <w:rFonts w:ascii="Calibri" w:hAnsi="Calibri" w:cs="Calibri"/>
+          <w:b/>
+          <w:bCs/>
+          <w:noProof/>
+        </w:rPr>
+        <w:t xml:space="preserve">                       </w:t>
+      </w:r>
+      <w:r>
+        <w:rPr>
+          <w:rFonts w:ascii="Calibri" w:hAnsi="Calibri" w:cs="Calibri"/>
+          <w:b/>
+          <w:bCs/>
+          <w:noProof/>
+        </w:rPr>
         <w:drawing>
-          <wp:inline distT="0" distB="0" distL="0" distR="0" wp14:anchorId="6022E39C" wp14:editId="126DA1EC">
-            <wp:extent cx="5401429" cy="4258269"/>
-            <wp:effectExtent l="0" t="0" r="8890" b="9525"/>
+          <wp:inline distT="0" distB="0" distL="0" distR="0" wp14:anchorId="6022E39C" wp14:editId="6A3319C1">
+            <wp:extent cx="2199172" cy="1733738"/>
+            <wp:effectExtent l="0" t="0" r="0" b="0"/>
             <wp:docPr id="1713341128" name="Picture 1" descr="A paper with text on it&#10;&#10;AI-generated content may be incorrect."/>
             <wp:cNvGraphicFramePr>
               <a:graphicFrameLocks xmlns:a="http://schemas.openxmlformats.org/drawingml/2006/main" noChangeAspect="1"/>
@@ -474,7 +636,7 @@
                   <pic:spPr>
                     <a:xfrm>
                       <a:off x="0" y="0"/>
-                      <a:ext cx="5401429" cy="4258269"/>
+                      <a:ext cx="2209687" cy="1742028"/>
                     </a:xfrm>
                     <a:prstGeom prst="rect">
                       <a:avLst/>
@@ -488,12 +650,24 @@
       </w:r>
     </w:p>
     <w:p>
-      <w:r>
-        <w:lastRenderedPageBreak/>
+      <w:pPr>
+        <w:rPr>
+          <w:rFonts w:ascii="Calibri" w:hAnsi="Calibri" w:cs="Calibri"/>
+          <w:b/>
+          <w:bCs/>
+        </w:rPr>
+      </w:pPr>
+      <w:r>
+        <w:rPr>
+          <w:rFonts w:ascii="Calibri" w:hAnsi="Calibri" w:cs="Calibri"/>
+          <w:b/>
+          <w:bCs/>
+          <w:noProof/>
+        </w:rPr>
         <w:drawing>
-          <wp:inline distT="0" distB="0" distL="0" distR="0" wp14:anchorId="6339C35D" wp14:editId="54344887">
-            <wp:extent cx="5515745" cy="4486901"/>
-            <wp:effectExtent l="0" t="0" r="8890" b="9525"/>
+          <wp:inline distT="0" distB="0" distL="0" distR="0" wp14:anchorId="6339C35D" wp14:editId="1AF6050C">
+            <wp:extent cx="2435382" cy="1981114"/>
+            <wp:effectExtent l="0" t="0" r="3175" b="635"/>
             <wp:docPr id="1167039452" name="Picture 1" descr="A close-up of a note&#10;&#10;AI-generated content may be incorrect."/>
             <wp:cNvGraphicFramePr>
               <a:graphicFrameLocks xmlns:a="http://schemas.openxmlformats.org/drawingml/2006/main" noChangeAspect="1"/>
@@ -514,7 +688,7 @@
                   <pic:spPr>
                     <a:xfrm>
                       <a:off x="0" y="0"/>
-                      <a:ext cx="5515745" cy="4486901"/>
+                      <a:ext cx="2447689" cy="1991126"/>
                     </a:xfrm>
                     <a:prstGeom prst="rect">
                       <a:avLst/>
@@ -526,13 +700,25 @@
           </wp:inline>
         </w:drawing>
       </w:r>
-    </w:p>
-    <w:p>
-      <w:r>
+      <w:r>
+        <w:rPr>
+          <w:rFonts w:ascii="Calibri" w:hAnsi="Calibri" w:cs="Calibri"/>
+          <w:b/>
+          <w:bCs/>
+        </w:rPr>
+        <w:t xml:space="preserve">       </w:t>
+      </w:r>
+      <w:r>
+        <w:rPr>
+          <w:rFonts w:ascii="Calibri" w:hAnsi="Calibri" w:cs="Calibri"/>
+          <w:b/>
+          <w:bCs/>
+          <w:noProof/>
+        </w:rPr>
         <w:drawing>
-          <wp:inline distT="0" distB="0" distL="0" distR="0" wp14:anchorId="1A2A4F6C" wp14:editId="7557F28E">
-            <wp:extent cx="5731510" cy="3291840"/>
-            <wp:effectExtent l="0" t="0" r="2540" b="3810"/>
+          <wp:inline distT="0" distB="0" distL="0" distR="0" wp14:anchorId="1A2A4F6C" wp14:editId="348C7BE1">
+            <wp:extent cx="2421802" cy="1390940"/>
+            <wp:effectExtent l="0" t="0" r="0" b="0"/>
             <wp:docPr id="1044350112" name="Picture 1" descr="A paper with writing on it&#10;&#10;AI-generated content may be incorrect."/>
             <wp:cNvGraphicFramePr>
               <a:graphicFrameLocks xmlns:a="http://schemas.openxmlformats.org/drawingml/2006/main" noChangeAspect="1"/>
@@ -553,7 +739,7 @@
                   <pic:spPr>
                     <a:xfrm>
                       <a:off x="0" y="0"/>
-                      <a:ext cx="5731510" cy="3291840"/>
+                      <a:ext cx="2433619" cy="1397727"/>
                     </a:xfrm>
                     <a:prstGeom prst="rect">
                       <a:avLst/>
@@ -566,15 +752,43 @@
         </w:drawing>
       </w:r>
     </w:p>
-    <w:p/>
-    <w:p/>
-    <w:p>
-      <w:r>
-        <w:lastRenderedPageBreak/>
+    <w:p>
+      <w:pPr>
+        <w:rPr>
+          <w:rFonts w:ascii="Calibri" w:hAnsi="Calibri" w:cs="Calibri"/>
+          <w:b/>
+          <w:bCs/>
+        </w:rPr>
+      </w:pPr>
+    </w:p>
+    <w:p>
+      <w:pPr>
+        <w:rPr>
+          <w:rFonts w:ascii="Calibri" w:hAnsi="Calibri" w:cs="Calibri"/>
+          <w:b/>
+          <w:bCs/>
+        </w:rPr>
+      </w:pPr>
+    </w:p>
+    <w:p>
+      <w:pPr>
+        <w:rPr>
+          <w:rFonts w:ascii="Calibri" w:hAnsi="Calibri" w:cs="Calibri"/>
+          <w:b/>
+          <w:bCs/>
+        </w:rPr>
+      </w:pPr>
+      <w:r>
+        <w:rPr>
+          <w:rFonts w:ascii="Calibri" w:hAnsi="Calibri" w:cs="Calibri"/>
+          <w:b/>
+          <w:bCs/>
+          <w:noProof/>
+        </w:rPr>
         <w:drawing>
-          <wp:inline distT="0" distB="0" distL="0" distR="0" wp14:anchorId="698993FC" wp14:editId="5A0764ED">
-            <wp:extent cx="5731510" cy="3113405"/>
-            <wp:effectExtent l="0" t="0" r="2540" b="0"/>
+          <wp:inline distT="0" distB="0" distL="0" distR="0" wp14:anchorId="698993FC" wp14:editId="1F430B90">
+            <wp:extent cx="2791662" cy="1516455"/>
+            <wp:effectExtent l="0" t="0" r="8890" b="7620"/>
             <wp:docPr id="1579152252" name="Picture 1" descr="A close up of a screen&#10;&#10;AI-generated content may be incorrect."/>
             <wp:cNvGraphicFramePr>
               <a:graphicFrameLocks xmlns:a="http://schemas.openxmlformats.org/drawingml/2006/main" noChangeAspect="1"/>
@@ -595,7 +809,7 @@
                   <pic:spPr>
                     <a:xfrm>
                       <a:off x="0" y="0"/>
-                      <a:ext cx="5731510" cy="3113405"/>
+                      <a:ext cx="2805357" cy="1523894"/>
                     </a:xfrm>
                     <a:prstGeom prst="rect">
                       <a:avLst/>
@@ -607,13 +821,17 @@
           </wp:inline>
         </w:drawing>
       </w:r>
-    </w:p>
-    <w:p>
-      <w:r>
+      <w:r>
+        <w:rPr>
+          <w:rFonts w:ascii="Calibri" w:hAnsi="Calibri" w:cs="Calibri"/>
+          <w:b/>
+          <w:bCs/>
+          <w:noProof/>
+        </w:rPr>
         <w:drawing>
-          <wp:inline distT="0" distB="0" distL="0" distR="0" wp14:anchorId="223F3D3B" wp14:editId="4B264B8E">
-            <wp:extent cx="5731510" cy="3490595"/>
-            <wp:effectExtent l="0" t="0" r="2540" b="0"/>
+          <wp:inline distT="0" distB="0" distL="0" distR="0" wp14:anchorId="223F3D3B" wp14:editId="5D1ED979">
+            <wp:extent cx="2772447" cy="1688471"/>
+            <wp:effectExtent l="0" t="0" r="8890" b="6985"/>
             <wp:docPr id="1924750246" name="Picture 1" descr="A screenshot of a video&#10;&#10;AI-generated content may be incorrect."/>
             <wp:cNvGraphicFramePr>
               <a:graphicFrameLocks xmlns:a="http://schemas.openxmlformats.org/drawingml/2006/main" noChangeAspect="1"/>
@@ -634,7 +852,7 @@
                   <pic:spPr>
                     <a:xfrm>
                       <a:off x="0" y="0"/>
-                      <a:ext cx="5731510" cy="3490595"/>
+                      <a:ext cx="2782989" cy="1694891"/>
                     </a:xfrm>
                     <a:prstGeom prst="rect">
                       <a:avLst/>
@@ -647,19 +865,53 @@
         </w:drawing>
       </w:r>
     </w:p>
-    <w:p/>
-    <w:p/>
-    <w:p/>
-    <w:p/>
-    <w:p/>
-    <w:p/>
-    <w:p>
-      <w:r>
+    <w:p>
+      <w:pPr>
+        <w:rPr>
+          <w:rFonts w:ascii="Calibri" w:hAnsi="Calibri" w:cs="Calibri"/>
+          <w:b/>
+          <w:bCs/>
+        </w:rPr>
+      </w:pPr>
+    </w:p>
+    <w:p>
+      <w:pPr>
+        <w:jc w:val="center"/>
+        <w:rPr>
+          <w:rFonts w:ascii="Calibri" w:hAnsi="Calibri" w:cs="Calibri"/>
+          <w:b/>
+          <w:bCs/>
+        </w:rPr>
+      </w:pPr>
+      <w:r>
+        <w:rPr>
+          <w:rFonts w:ascii="Calibri" w:hAnsi="Calibri" w:cs="Calibri"/>
+          <w:b/>
+          <w:bCs/>
+        </w:rPr>
         <w:lastRenderedPageBreak/>
+        <w:t>TOOLS</w:t>
+      </w:r>
+    </w:p>
+    <w:p>
+      <w:pPr>
+        <w:rPr>
+          <w:rFonts w:ascii="Calibri" w:hAnsi="Calibri" w:cs="Calibri"/>
+          <w:b/>
+          <w:bCs/>
+        </w:rPr>
+      </w:pPr>
+      <w:r>
+        <w:rPr>
+          <w:rFonts w:ascii="Calibri" w:hAnsi="Calibri" w:cs="Calibri"/>
+          <w:b/>
+          <w:bCs/>
+          <w:noProof/>
+        </w:rPr>
         <w:drawing>
-          <wp:inline distT="0" distB="0" distL="0" distR="0" wp14:anchorId="07AAFA48" wp14:editId="3BF71A41">
-            <wp:extent cx="5731510" cy="3900805"/>
-            <wp:effectExtent l="0" t="0" r="2540" b="4445"/>
+          <wp:inline distT="0" distB="0" distL="0" distR="0" wp14:anchorId="07AAFA48" wp14:editId="0DAC89DD">
+            <wp:extent cx="5867400" cy="2905076"/>
+            <wp:effectExtent l="0" t="0" r="0" b="0"/>
             <wp:docPr id="690970449" name="Picture 1"/>
             <wp:cNvGraphicFramePr>
               <a:graphicFrameLocks xmlns:a="http://schemas.openxmlformats.org/drawingml/2006/main" noChangeAspect="1"/>
@@ -680,7 +932,7 @@
                   <pic:spPr>
                     <a:xfrm>
                       <a:off x="0" y="0"/>
-                      <a:ext cx="5731510" cy="3900805"/>
+                      <a:ext cx="5881036" cy="2911827"/>
                     </a:xfrm>
                     <a:prstGeom prst="rect">
                       <a:avLst/>
@@ -693,8 +945,618 @@
         </w:drawing>
       </w:r>
     </w:p>
-    <w:p/>
-    <w:p/>
+    <w:p>
+      <w:pPr>
+        <w:rPr>
+          <w:rFonts w:ascii="Calibri" w:hAnsi="Calibri" w:cs="Calibri"/>
+          <w:b/>
+          <w:bCs/>
+        </w:rPr>
+      </w:pPr>
+    </w:p>
+    <w:p>
+      <w:pPr>
+        <w:rPr>
+          <w:rFonts w:ascii="Calibri" w:hAnsi="Calibri" w:cs="Calibri"/>
+          <w:b/>
+          <w:bCs/>
+        </w:rPr>
+      </w:pPr>
+    </w:p>
+    <w:p>
+      <w:pPr>
+        <w:rPr>
+          <w:rFonts w:ascii="Calibri" w:hAnsi="Calibri" w:cs="Calibri"/>
+          <w:b/>
+          <w:bCs/>
+        </w:rPr>
+      </w:pPr>
+    </w:p>
+    <w:p>
+      <w:pPr>
+        <w:rPr>
+          <w:rFonts w:ascii="Calibri" w:hAnsi="Calibri" w:cs="Calibri"/>
+          <w:b/>
+          <w:bCs/>
+        </w:rPr>
+      </w:pPr>
+    </w:p>
+    <w:p>
+      <w:pPr>
+        <w:rPr>
+          <w:rFonts w:ascii="Calibri" w:hAnsi="Calibri" w:cs="Calibri"/>
+          <w:b/>
+          <w:bCs/>
+        </w:rPr>
+      </w:pPr>
+    </w:p>
+    <w:p>
+      <w:pPr>
+        <w:rPr>
+          <w:rFonts w:ascii="Calibri" w:hAnsi="Calibri" w:cs="Calibri"/>
+          <w:b/>
+          <w:bCs/>
+        </w:rPr>
+      </w:pPr>
+    </w:p>
+    <w:p>
+      <w:pPr>
+        <w:rPr>
+          <w:rFonts w:ascii="Calibri" w:hAnsi="Calibri" w:cs="Calibri"/>
+          <w:b/>
+          <w:bCs/>
+        </w:rPr>
+      </w:pPr>
+    </w:p>
+    <w:p>
+      <w:pPr>
+        <w:rPr>
+          <w:rFonts w:ascii="Calibri" w:hAnsi="Calibri" w:cs="Calibri"/>
+          <w:b/>
+          <w:bCs/>
+        </w:rPr>
+      </w:pPr>
+    </w:p>
+    <w:p>
+      <w:pPr>
+        <w:rPr>
+          <w:rFonts w:ascii="Calibri" w:hAnsi="Calibri" w:cs="Calibri"/>
+          <w:b/>
+          <w:bCs/>
+        </w:rPr>
+      </w:pPr>
+    </w:p>
+    <w:p>
+      <w:pPr>
+        <w:rPr>
+          <w:rFonts w:ascii="Calibri" w:hAnsi="Calibri" w:cs="Calibri"/>
+          <w:b/>
+          <w:bCs/>
+        </w:rPr>
+      </w:pPr>
+    </w:p>
+    <w:p>
+      <w:pPr>
+        <w:rPr>
+          <w:rFonts w:ascii="Calibri" w:hAnsi="Calibri" w:cs="Calibri"/>
+          <w:b/>
+          <w:bCs/>
+        </w:rPr>
+      </w:pPr>
+    </w:p>
+    <w:p>
+      <w:pPr>
+        <w:rPr>
+          <w:rFonts w:ascii="Calibri" w:hAnsi="Calibri" w:cs="Calibri"/>
+          <w:b/>
+          <w:bCs/>
+        </w:rPr>
+      </w:pPr>
+    </w:p>
+    <w:p>
+      <w:pPr>
+        <w:rPr>
+          <w:rFonts w:ascii="Calibri" w:hAnsi="Calibri" w:cs="Calibri"/>
+          <w:b/>
+          <w:bCs/>
+        </w:rPr>
+      </w:pPr>
+    </w:p>
+    <w:p>
+      <w:pPr>
+        <w:rPr>
+          <w:rFonts w:ascii="Calibri" w:hAnsi="Calibri" w:cs="Calibri"/>
+          <w:b/>
+          <w:bCs/>
+        </w:rPr>
+      </w:pPr>
+    </w:p>
+    <w:p>
+      <w:pPr>
+        <w:rPr>
+          <w:rFonts w:ascii="Calibri" w:hAnsi="Calibri" w:cs="Calibri"/>
+          <w:b/>
+          <w:bCs/>
+        </w:rPr>
+      </w:pPr>
+    </w:p>
+    <w:p>
+      <w:pPr>
+        <w:rPr>
+          <w:rFonts w:ascii="Calibri" w:hAnsi="Calibri" w:cs="Calibri"/>
+          <w:b/>
+          <w:bCs/>
+        </w:rPr>
+      </w:pPr>
+    </w:p>
+    <w:p>
+      <w:pPr>
+        <w:rPr>
+          <w:rFonts w:ascii="Calibri" w:hAnsi="Calibri" w:cs="Calibri"/>
+          <w:b/>
+          <w:bCs/>
+        </w:rPr>
+      </w:pPr>
+    </w:p>
+    <w:p>
+      <w:pPr>
+        <w:jc w:val="center"/>
+        <w:rPr>
+          <w:rFonts w:ascii="Calibri" w:hAnsi="Calibri" w:cs="Calibri"/>
+          <w:b/>
+          <w:bCs/>
+        </w:rPr>
+      </w:pPr>
+      <w:r>
+        <w:rPr>
+          <w:rFonts w:ascii="Calibri" w:hAnsi="Calibri" w:cs="Calibri"/>
+          <w:b/>
+          <w:bCs/>
+        </w:rPr>
+        <w:lastRenderedPageBreak/>
+        <w:t>JAVA</w:t>
+      </w:r>
+    </w:p>
+    <w:p>
+      <w:pPr>
+        <w:rPr>
+          <w:rFonts w:ascii="Calibri" w:hAnsi="Calibri" w:cs="Calibri"/>
+          <w:b/>
+          <w:bCs/>
+          <w:sz w:val="28"/>
+          <w:szCs w:val="28"/>
+        </w:rPr>
+      </w:pPr>
+      <w:r>
+        <w:rPr>
+          <w:rFonts w:ascii="Calibri" w:hAnsi="Calibri" w:cs="Calibri"/>
+          <w:b/>
+          <w:bCs/>
+          <w:sz w:val="28"/>
+          <w:szCs w:val="28"/>
+        </w:rPr>
+        <w:drawing>
+          <wp:inline distT="0" distB="0" distL="0" distR="0" wp14:anchorId="096EC97C" wp14:editId="26975AAB">
+            <wp:extent cx="5731510" cy="3177540"/>
+            <wp:effectExtent l="0" t="0" r="2540" b="3810"/>
+            <wp:docPr id="923287899" name="Picture 1"/>
+            <wp:cNvGraphicFramePr>
+              <a:graphicFrameLocks xmlns:a="http://schemas.openxmlformats.org/drawingml/2006/main" noChangeAspect="1"/>
+            </wp:cNvGraphicFramePr>
+            <a:graphic xmlns:a="http://schemas.openxmlformats.org/drawingml/2006/main">
+              <a:graphicData uri="http://schemas.openxmlformats.org/drawingml/2006/picture">
+                <pic:pic xmlns:pic="http://schemas.openxmlformats.org/drawingml/2006/picture">
+                  <pic:nvPicPr>
+                    <pic:cNvPr id="923287899" name=""/>
+                    <pic:cNvPicPr/>
+                  </pic:nvPicPr>
+                  <pic:blipFill>
+                    <a:blip r:embed="rId21"/>
+                    <a:stretch>
+                      <a:fillRect/>
+                    </a:stretch>
+                  </pic:blipFill>
+                  <pic:spPr>
+                    <a:xfrm>
+                      <a:off x="0" y="0"/>
+                      <a:ext cx="5731510" cy="3177540"/>
+                    </a:xfrm>
+                    <a:prstGeom prst="rect">
+                      <a:avLst/>
+                    </a:prstGeom>
+                  </pic:spPr>
+                </pic:pic>
+              </a:graphicData>
+            </a:graphic>
+          </wp:inline>
+        </w:drawing>
+      </w:r>
+    </w:p>
+    <w:p>
+      <w:pPr>
+        <w:rPr>
+          <w:rFonts w:ascii="Calibri" w:hAnsi="Calibri" w:cs="Calibri"/>
+          <w:b/>
+          <w:bCs/>
+          <w:sz w:val="20"/>
+          <w:szCs w:val="20"/>
+        </w:rPr>
+      </w:pPr>
+      <w:r>
+        <w:rPr>
+          <w:rFonts w:ascii="Calibri" w:hAnsi="Calibri" w:cs="Calibri"/>
+          <w:b/>
+          <w:bCs/>
+          <w:sz w:val="20"/>
+          <w:szCs w:val="20"/>
+        </w:rPr>
+        <w:t>Ex</w:t>
+      </w:r>
+      <w:r>
+        <w:rPr>
+          <w:rFonts w:ascii="Calibri" w:hAnsi="Calibri" w:cs="Calibri"/>
+          <w:b/>
+          <w:bCs/>
+          <w:sz w:val="20"/>
+          <w:szCs w:val="20"/>
+        </w:rPr>
+        <w:t>ample:</w:t>
+      </w:r>
+    </w:p>
+    <w:p>
+      <w:pPr>
+        <w:rPr>
+          <w:rFonts w:ascii="Calibri" w:hAnsi="Calibri" w:cs="Calibri"/>
+          <w:sz w:val="18"/>
+          <w:szCs w:val="18"/>
+        </w:rPr>
+      </w:pPr>
+      <w:r>
+        <w:rPr>
+          <w:rFonts w:ascii="Calibri" w:hAnsi="Calibri" w:cs="Calibri"/>
+          <w:sz w:val="18"/>
+          <w:szCs w:val="18"/>
+        </w:rPr>
+        <w:t>public static void main(String[] args) {</w:t>
+      </w:r>
+      <w:r>
+        <w:rPr>
+          <w:rFonts w:ascii="Calibri" w:hAnsi="Calibri" w:cs="Calibri"/>
+          <w:sz w:val="18"/>
+          <w:szCs w:val="18"/>
+        </w:rPr>
+        <w:br/>
+      </w:r>
+      <w:r>
+        <w:rPr>
+          <w:rFonts w:ascii="Calibri" w:hAnsi="Calibri" w:cs="Calibri"/>
+          <w:sz w:val="18"/>
+          <w:szCs w:val="18"/>
+        </w:rPr>
+        <w:br/>
+        <w:t xml:space="preserve">    System.</w:t>
+      </w:r>
+      <w:r>
+        <w:rPr>
+          <w:rFonts w:ascii="Calibri" w:hAnsi="Calibri" w:cs="Calibri"/>
+          <w:i/>
+          <w:iCs/>
+          <w:sz w:val="18"/>
+          <w:szCs w:val="18"/>
+        </w:rPr>
+        <w:t>out</w:t>
+      </w:r>
+      <w:r>
+        <w:rPr>
+          <w:rFonts w:ascii="Calibri" w:hAnsi="Calibri" w:cs="Calibri"/>
+          <w:sz w:val="18"/>
+          <w:szCs w:val="18"/>
+        </w:rPr>
+        <w:t>.println("Hello World !!");</w:t>
+      </w:r>
+      <w:r>
+        <w:rPr>
+          <w:rFonts w:ascii="Calibri" w:hAnsi="Calibri" w:cs="Calibri"/>
+          <w:sz w:val="18"/>
+          <w:szCs w:val="18"/>
+        </w:rPr>
+        <w:br/>
+        <w:t xml:space="preserve">    System.</w:t>
+      </w:r>
+      <w:r>
+        <w:rPr>
+          <w:rFonts w:ascii="Calibri" w:hAnsi="Calibri" w:cs="Calibri"/>
+          <w:i/>
+          <w:iCs/>
+          <w:sz w:val="18"/>
+          <w:szCs w:val="18"/>
+        </w:rPr>
+        <w:t>out</w:t>
+      </w:r>
+      <w:r>
+        <w:rPr>
+          <w:rFonts w:ascii="Calibri" w:hAnsi="Calibri" w:cs="Calibri"/>
+          <w:sz w:val="18"/>
+          <w:szCs w:val="18"/>
+        </w:rPr>
+        <w:t>.println(555 + 888 - 222 * 6666);</w:t>
+      </w:r>
+      <w:r>
+        <w:rPr>
+          <w:rFonts w:ascii="Calibri" w:hAnsi="Calibri" w:cs="Calibri"/>
+          <w:sz w:val="18"/>
+          <w:szCs w:val="18"/>
+        </w:rPr>
+        <w:br/>
+      </w:r>
+      <w:r>
+        <w:rPr>
+          <w:rFonts w:ascii="Calibri" w:hAnsi="Calibri" w:cs="Calibri"/>
+          <w:sz w:val="18"/>
+          <w:szCs w:val="18"/>
+        </w:rPr>
+        <w:br/>
+        <w:t xml:space="preserve">    </w:t>
+      </w:r>
+      <w:r>
+        <w:rPr>
+          <w:rFonts w:ascii="Calibri" w:hAnsi="Calibri" w:cs="Calibri"/>
+          <w:i/>
+          <w:iCs/>
+          <w:sz w:val="18"/>
+          <w:szCs w:val="18"/>
+        </w:rPr>
+        <w:t>//Left to Right Execution: BODMAS Rule</w:t>
+      </w:r>
+      <w:r>
+        <w:rPr>
+          <w:rFonts w:ascii="Calibri" w:hAnsi="Calibri" w:cs="Calibri"/>
+          <w:i/>
+          <w:iCs/>
+          <w:sz w:val="18"/>
+          <w:szCs w:val="18"/>
+        </w:rPr>
+        <w:br/>
+        <w:t xml:space="preserve">    </w:t>
+      </w:r>
+      <w:r>
+        <w:rPr>
+          <w:rFonts w:ascii="Calibri" w:hAnsi="Calibri" w:cs="Calibri"/>
+          <w:sz w:val="18"/>
+          <w:szCs w:val="18"/>
+        </w:rPr>
+        <w:t>System.</w:t>
+      </w:r>
+      <w:r>
+        <w:rPr>
+          <w:rFonts w:ascii="Calibri" w:hAnsi="Calibri" w:cs="Calibri"/>
+          <w:i/>
+          <w:iCs/>
+          <w:sz w:val="18"/>
+          <w:szCs w:val="18"/>
+        </w:rPr>
+        <w:t>out</w:t>
+      </w:r>
+      <w:r>
+        <w:rPr>
+          <w:rFonts w:ascii="Calibri" w:hAnsi="Calibri" w:cs="Calibri"/>
+          <w:sz w:val="18"/>
+          <w:szCs w:val="18"/>
+        </w:rPr>
+        <w:t xml:space="preserve">.println("Sum of " + 555 + 555);  </w:t>
+      </w:r>
+      <w:r>
+        <w:rPr>
+          <w:rFonts w:ascii="Calibri" w:hAnsi="Calibri" w:cs="Calibri"/>
+          <w:i/>
+          <w:iCs/>
+          <w:sz w:val="18"/>
+          <w:szCs w:val="18"/>
+        </w:rPr>
+        <w:t>//Sum of 555555 -&gt; Left to Right execution so Concatenation</w:t>
+      </w:r>
+      <w:r>
+        <w:rPr>
+          <w:rFonts w:ascii="Calibri" w:hAnsi="Calibri" w:cs="Calibri"/>
+          <w:i/>
+          <w:iCs/>
+          <w:sz w:val="18"/>
+          <w:szCs w:val="18"/>
+        </w:rPr>
+        <w:br/>
+        <w:t xml:space="preserve">    </w:t>
+      </w:r>
+      <w:r>
+        <w:rPr>
+          <w:rFonts w:ascii="Calibri" w:hAnsi="Calibri" w:cs="Calibri"/>
+          <w:sz w:val="18"/>
+          <w:szCs w:val="18"/>
+        </w:rPr>
+        <w:t>System.</w:t>
+      </w:r>
+      <w:r>
+        <w:rPr>
+          <w:rFonts w:ascii="Calibri" w:hAnsi="Calibri" w:cs="Calibri"/>
+          <w:i/>
+          <w:iCs/>
+          <w:sz w:val="18"/>
+          <w:szCs w:val="18"/>
+        </w:rPr>
+        <w:t>out</w:t>
+      </w:r>
+      <w:r>
+        <w:rPr>
+          <w:rFonts w:ascii="Calibri" w:hAnsi="Calibri" w:cs="Calibri"/>
+          <w:sz w:val="18"/>
+          <w:szCs w:val="18"/>
+        </w:rPr>
+        <w:t xml:space="preserve">.println(555 + 555+" Sum is"); </w:t>
+      </w:r>
+      <w:r>
+        <w:rPr>
+          <w:rFonts w:ascii="Calibri" w:hAnsi="Calibri" w:cs="Calibri"/>
+          <w:i/>
+          <w:iCs/>
+          <w:sz w:val="18"/>
+          <w:szCs w:val="18"/>
+        </w:rPr>
+        <w:t>//1110 Sum is</w:t>
+      </w:r>
+      <w:r>
+        <w:rPr>
+          <w:rFonts w:ascii="Calibri" w:hAnsi="Calibri" w:cs="Calibri"/>
+          <w:i/>
+          <w:iCs/>
+          <w:sz w:val="18"/>
+          <w:szCs w:val="18"/>
+        </w:rPr>
+        <w:br/>
+        <w:t xml:space="preserve">    </w:t>
+      </w:r>
+      <w:r>
+        <w:rPr>
+          <w:rFonts w:ascii="Calibri" w:hAnsi="Calibri" w:cs="Calibri"/>
+          <w:sz w:val="18"/>
+          <w:szCs w:val="18"/>
+        </w:rPr>
+        <w:t>System.</w:t>
+      </w:r>
+      <w:r>
+        <w:rPr>
+          <w:rFonts w:ascii="Calibri" w:hAnsi="Calibri" w:cs="Calibri"/>
+          <w:i/>
+          <w:iCs/>
+          <w:sz w:val="18"/>
+          <w:szCs w:val="18"/>
+        </w:rPr>
+        <w:t>out</w:t>
+      </w:r>
+      <w:r>
+        <w:rPr>
+          <w:rFonts w:ascii="Calibri" w:hAnsi="Calibri" w:cs="Calibri"/>
+          <w:sz w:val="18"/>
+          <w:szCs w:val="18"/>
+        </w:rPr>
+        <w:t xml:space="preserve">.println(555 + 555+" Sum is"+6666+666); </w:t>
+      </w:r>
+      <w:r>
+        <w:rPr>
+          <w:rFonts w:ascii="Calibri" w:hAnsi="Calibri" w:cs="Calibri"/>
+          <w:i/>
+          <w:iCs/>
+          <w:sz w:val="18"/>
+          <w:szCs w:val="18"/>
+        </w:rPr>
+        <w:t>//1110 Sum is6666666</w:t>
+      </w:r>
+      <w:r>
+        <w:rPr>
+          <w:rFonts w:ascii="Calibri" w:hAnsi="Calibri" w:cs="Calibri"/>
+          <w:i/>
+          <w:iCs/>
+          <w:sz w:val="18"/>
+          <w:szCs w:val="18"/>
+        </w:rPr>
+        <w:br/>
+      </w:r>
+      <w:r>
+        <w:rPr>
+          <w:rFonts w:ascii="Calibri" w:hAnsi="Calibri" w:cs="Calibri"/>
+          <w:i/>
+          <w:iCs/>
+          <w:sz w:val="18"/>
+          <w:szCs w:val="18"/>
+        </w:rPr>
+        <w:br/>
+        <w:t xml:space="preserve">    </w:t>
+      </w:r>
+      <w:r>
+        <w:rPr>
+          <w:rFonts w:ascii="Calibri" w:hAnsi="Calibri" w:cs="Calibri"/>
+          <w:sz w:val="18"/>
+          <w:szCs w:val="18"/>
+        </w:rPr>
+        <w:t>System.</w:t>
+      </w:r>
+      <w:r>
+        <w:rPr>
+          <w:rFonts w:ascii="Calibri" w:hAnsi="Calibri" w:cs="Calibri"/>
+          <w:i/>
+          <w:iCs/>
+          <w:sz w:val="18"/>
+          <w:szCs w:val="18"/>
+        </w:rPr>
+        <w:t>out</w:t>
+      </w:r>
+      <w:r>
+        <w:rPr>
+          <w:rFonts w:ascii="Calibri" w:hAnsi="Calibri" w:cs="Calibri"/>
+          <w:sz w:val="18"/>
+          <w:szCs w:val="18"/>
+        </w:rPr>
+        <w:t xml:space="preserve">.println((555 + 555)+" Sum is"+(6666+666)); </w:t>
+      </w:r>
+      <w:r>
+        <w:rPr>
+          <w:rFonts w:ascii="Calibri" w:hAnsi="Calibri" w:cs="Calibri"/>
+          <w:i/>
+          <w:iCs/>
+          <w:sz w:val="18"/>
+          <w:szCs w:val="18"/>
+        </w:rPr>
+        <w:t>//1110 Sum is7332</w:t>
+      </w:r>
+      <w:r>
+        <w:rPr>
+          <w:rFonts w:ascii="Calibri" w:hAnsi="Calibri" w:cs="Calibri"/>
+          <w:i/>
+          <w:iCs/>
+          <w:sz w:val="18"/>
+          <w:szCs w:val="18"/>
+        </w:rPr>
+        <w:br/>
+      </w:r>
+      <w:r>
+        <w:rPr>
+          <w:rFonts w:ascii="Calibri" w:hAnsi="Calibri" w:cs="Calibri"/>
+          <w:i/>
+          <w:iCs/>
+          <w:sz w:val="18"/>
+          <w:szCs w:val="18"/>
+        </w:rPr>
+        <w:br/>
+      </w:r>
+      <w:r>
+        <w:rPr>
+          <w:rFonts w:ascii="Calibri" w:hAnsi="Calibri" w:cs="Calibri"/>
+          <w:sz w:val="18"/>
+          <w:szCs w:val="18"/>
+        </w:rPr>
+        <w:t>}</w:t>
+      </w:r>
+    </w:p>
+    <w:p>
+      <w:pPr>
+        <w:rPr>
+          <w:rFonts w:ascii="Calibri" w:hAnsi="Calibri" w:cs="Calibri"/>
+          <w:b/>
+          <w:bCs/>
+          <w:sz w:val="28"/>
+          <w:szCs w:val="28"/>
+        </w:rPr>
+      </w:pPr>
+    </w:p>
+    <w:p>
+      <w:pPr>
+        <w:rPr>
+          <w:rFonts w:ascii="Calibri" w:hAnsi="Calibri" w:cs="Calibri"/>
+          <w:b/>
+          <w:bCs/>
+          <w:sz w:val="28"/>
+          <w:szCs w:val="28"/>
+        </w:rPr>
+      </w:pPr>
+    </w:p>
     <w:sectPr>
       <w:pgSz w:w="11906" w:h="16838"/>
       <w:pgMar w:top="1440" w:right="1440" w:bottom="1440" w:left="1440" w:header="708" w:footer="708" w:gutter="0"/>
@@ -1308,7 +2170,6 @@
   <w:style w:type="character" w:default="1" w:styleId="DefaultParagraphFont">
     <w:name w:val="Default Paragraph Font"/>
     <w:uiPriority w:val="1"/>
-    <w:semiHidden/>
     <w:unhideWhenUsed/>
   </w:style>
   <w:style w:type="table" w:default="1" w:styleId="TableNormal">

</xml_diff>

<commit_message>
Rest Assured Java Day 3
</commit_message>
<xml_diff>
--- a/RestAssuredNotesIsha.docx
+++ b/RestAssuredNotesIsha.docx
@@ -9,6 +9,7 @@
           <w:rFonts w:ascii="Calibri" w:hAnsi="Calibri" w:cs="Calibri"/>
           <w:b/>
           <w:bCs/>
+          <w:color w:val="156082" w:themeColor="accent1"/>
           <w:sz w:val="28"/>
           <w:szCs w:val="28"/>
         </w:rPr>
@@ -18,6 +19,7 @@
           <w:rFonts w:ascii="Calibri" w:hAnsi="Calibri" w:cs="Calibri"/>
           <w:b/>
           <w:bCs/>
+          <w:color w:val="156082" w:themeColor="accent1"/>
           <w:sz w:val="28"/>
           <w:szCs w:val="28"/>
         </w:rPr>
@@ -41,13 +43,15 @@
           <w:rFonts w:ascii="Calibri" w:hAnsi="Calibri" w:cs="Calibri"/>
           <w:b/>
           <w:bCs/>
-        </w:rPr>
-      </w:pPr>
-      <w:r>
-        <w:rPr>
-          <w:rFonts w:ascii="Calibri" w:hAnsi="Calibri" w:cs="Calibri"/>
-          <w:b/>
-          <w:bCs/>
+          <w:color w:val="156082" w:themeColor="accent1"/>
+        </w:rPr>
+      </w:pPr>
+      <w:r>
+        <w:rPr>
+          <w:rFonts w:ascii="Calibri" w:hAnsi="Calibri" w:cs="Calibri"/>
+          <w:b/>
+          <w:bCs/>
+          <w:color w:val="156082" w:themeColor="accent1"/>
         </w:rPr>
         <w:t>COURSE CONTENTS:</w:t>
       </w:r>
@@ -881,13 +885,15 @@
           <w:rFonts w:ascii="Calibri" w:hAnsi="Calibri" w:cs="Calibri"/>
           <w:b/>
           <w:bCs/>
-        </w:rPr>
-      </w:pPr>
-      <w:r>
-        <w:rPr>
-          <w:rFonts w:ascii="Calibri" w:hAnsi="Calibri" w:cs="Calibri"/>
-          <w:b/>
-          <w:bCs/>
+          <w:color w:val="156082" w:themeColor="accent1"/>
+        </w:rPr>
+      </w:pPr>
+      <w:r>
+        <w:rPr>
+          <w:rFonts w:ascii="Calibri" w:hAnsi="Calibri" w:cs="Calibri"/>
+          <w:b/>
+          <w:bCs/>
+          <w:color w:val="156082" w:themeColor="accent1"/>
         </w:rPr>
         <w:lastRenderedPageBreak/>
         <w:t>TOOLS</w:t>
@@ -958,6 +964,7 @@
       <w:pPr>
         <w:rPr>
           <w:rFonts w:ascii="Calibri" w:hAnsi="Calibri" w:cs="Calibri"/>
+          <w:color w:val="156082" w:themeColor="accent1"/>
           <w:sz w:val="20"/>
           <w:szCs w:val="20"/>
         </w:rPr>
@@ -967,6 +974,7 @@
           <w:rFonts w:ascii="Calibri" w:hAnsi="Calibri" w:cs="Calibri"/>
           <w:b/>
           <w:bCs/>
+          <w:color w:val="156082" w:themeColor="accent1"/>
           <w:sz w:val="20"/>
           <w:szCs w:val="20"/>
         </w:rPr>
@@ -975,6 +983,7 @@
       <w:r>
         <w:rPr>
           <w:rFonts w:ascii="Calibri" w:hAnsi="Calibri" w:cs="Calibri"/>
+          <w:color w:val="156082" w:themeColor="accent1"/>
           <w:sz w:val="20"/>
           <w:szCs w:val="20"/>
         </w:rPr>
@@ -1009,7 +1018,6 @@
           <w:szCs w:val="20"/>
         </w:rPr>
       </w:pPr>
-      <w:proofErr w:type="spellStart"/>
       <w:r>
         <w:rPr>
           <w:rFonts w:ascii="Calibri" w:hAnsi="Calibri" w:cs="Calibri"/>
@@ -1026,12 +1034,14 @@
         </w:rPr>
         <w:t>andeeshclmysore</w:t>
       </w:r>
-      <w:proofErr w:type="spellEnd"/>
-    </w:p>
-    <w:p>
-      <w:pPr>
-        <w:rPr>
-          <w:rFonts w:ascii="Calibri" w:hAnsi="Calibri" w:cs="Calibri"/>
+    </w:p>
+    <w:p>
+      <w:pPr>
+        <w:rPr>
+          <w:rFonts w:ascii="Calibri" w:hAnsi="Calibri" w:cs="Calibri"/>
+          <w:b/>
+          <w:bCs/>
+          <w:color w:val="156082" w:themeColor="accent1"/>
           <w:sz w:val="20"/>
           <w:szCs w:val="20"/>
         </w:rPr>
@@ -1041,26 +1051,88 @@
           <w:rFonts w:ascii="Calibri" w:hAnsi="Calibri" w:cs="Calibri"/>
           <w:b/>
           <w:bCs/>
+          <w:color w:val="156082" w:themeColor="accent1"/>
           <w:sz w:val="20"/>
           <w:szCs w:val="20"/>
         </w:rPr>
         <w:t xml:space="preserve">Class Link: </w:t>
       </w:r>
+    </w:p>
+    <w:p>
+      <w:pPr>
+        <w:rPr>
+          <w:sz w:val="18"/>
+          <w:szCs w:val="18"/>
+        </w:rPr>
+      </w:pPr>
       <w:hyperlink r:id="rId23" w:history="1">
         <w:r>
           <w:rPr>
             <w:rStyle w:val="Hyperlink"/>
-            <w:rFonts w:ascii="Calibri" w:hAnsi="Calibri" w:cs="Calibri"/>
-            <w:sz w:val="20"/>
-            <w:szCs w:val="20"/>
+            <w:sz w:val="18"/>
+            <w:szCs w:val="18"/>
           </w:rPr>
-          <w:t>https://www.youtube.com/watch?v=6k7f_6_onBQ&amp;list=PLpVPFODLvNXPVxfmzqmIwVr5q1AB3by1q&amp;index=1</w:t>
+          <w:t>API Testing, Demo on 4th Aug Batch 2025 @9 PM  Pls contact or whatsapp us on +91-9133190573</w:t>
         </w:r>
       </w:hyperlink>
     </w:p>
     <w:p>
       <w:pPr>
         <w:rPr>
+          <w:sz w:val="18"/>
+          <w:szCs w:val="18"/>
+        </w:rPr>
+      </w:pPr>
+      <w:hyperlink r:id="rId24" w:history="1">
+        <w:r>
+          <w:rPr>
+            <w:rStyle w:val="Hyperlink"/>
+            <w:sz w:val="18"/>
+            <w:szCs w:val="18"/>
+          </w:rPr>
+          <w:t>2025-Rest Assured API Aug @9 PM (IST) by Rahul sir</w:t>
+        </w:r>
+      </w:hyperlink>
+    </w:p>
+    <w:p>
+      <w:pPr>
+        <w:rPr>
+          <w:sz w:val="18"/>
+          <w:szCs w:val="18"/>
+        </w:rPr>
+      </w:pPr>
+      <w:hyperlink r:id="rId25" w:history="1">
+        <w:r>
+          <w:rPr>
+            <w:rStyle w:val="Hyperlink"/>
+            <w:sz w:val="18"/>
+            <w:szCs w:val="18"/>
+          </w:rPr>
+          <w:t>https://drive.google.com/drive/folders/1Fvjb52XEi12GYj64xvhgH1FOnzgOTshR</w:t>
+        </w:r>
+      </w:hyperlink>
+    </w:p>
+    <w:p>
+      <w:pPr>
+        <w:rPr>
+          <w:sz w:val="18"/>
+          <w:szCs w:val="18"/>
+        </w:rPr>
+      </w:pPr>
+      <w:hyperlink r:id="rId26" w:history="1">
+        <w:r>
+          <w:rPr>
+            <w:rStyle w:val="Hyperlink"/>
+            <w:sz w:val="18"/>
+            <w:szCs w:val="18"/>
+          </w:rPr>
+          <w:t>https://drive.google.com/drive/folders/1GDPZvfFyENvYIPVDYac9xoEMZP4TIyOa</w:t>
+        </w:r>
+      </w:hyperlink>
+    </w:p>
+    <w:p>
+      <w:pPr>
+        <w:rPr>
           <w:rFonts w:ascii="Calibri" w:hAnsi="Calibri" w:cs="Calibri"/>
           <w:sz w:val="20"/>
           <w:szCs w:val="20"/>
@@ -1071,71 +1143,8 @@
       <w:pPr>
         <w:rPr>
           <w:rFonts w:ascii="Calibri" w:hAnsi="Calibri" w:cs="Calibri"/>
-          <w:b/>
-          <w:bCs/>
-        </w:rPr>
-      </w:pPr>
-    </w:p>
-    <w:p>
-      <w:pPr>
-        <w:rPr>
-          <w:rFonts w:ascii="Calibri" w:hAnsi="Calibri" w:cs="Calibri"/>
-          <w:b/>
-          <w:bCs/>
-        </w:rPr>
-      </w:pPr>
-    </w:p>
-    <w:p>
-      <w:pPr>
-        <w:rPr>
-          <w:rFonts w:ascii="Calibri" w:hAnsi="Calibri" w:cs="Calibri"/>
-          <w:b/>
-          <w:bCs/>
-        </w:rPr>
-      </w:pPr>
-    </w:p>
-    <w:p>
-      <w:pPr>
-        <w:rPr>
-          <w:rFonts w:ascii="Calibri" w:hAnsi="Calibri" w:cs="Calibri"/>
-          <w:b/>
-          <w:bCs/>
-        </w:rPr>
-      </w:pPr>
-    </w:p>
-    <w:p>
-      <w:pPr>
-        <w:rPr>
-          <w:rFonts w:ascii="Calibri" w:hAnsi="Calibri" w:cs="Calibri"/>
-          <w:b/>
-          <w:bCs/>
-        </w:rPr>
-      </w:pPr>
-    </w:p>
-    <w:p>
-      <w:pPr>
-        <w:rPr>
-          <w:rFonts w:ascii="Calibri" w:hAnsi="Calibri" w:cs="Calibri"/>
-          <w:b/>
-          <w:bCs/>
-        </w:rPr>
-      </w:pPr>
-    </w:p>
-    <w:p>
-      <w:pPr>
-        <w:rPr>
-          <w:rFonts w:ascii="Calibri" w:hAnsi="Calibri" w:cs="Calibri"/>
-          <w:b/>
-          <w:bCs/>
-        </w:rPr>
-      </w:pPr>
-    </w:p>
-    <w:p>
-      <w:pPr>
-        <w:rPr>
-          <w:rFonts w:ascii="Calibri" w:hAnsi="Calibri" w:cs="Calibri"/>
-          <w:b/>
-          <w:bCs/>
+          <w:sz w:val="20"/>
+          <w:szCs w:val="20"/>
         </w:rPr>
       </w:pPr>
     </w:p>
@@ -1218,14 +1227,21 @@
           <w:rFonts w:ascii="Calibri" w:hAnsi="Calibri" w:cs="Calibri"/>
           <w:b/>
           <w:bCs/>
-        </w:rPr>
-      </w:pPr>
-      <w:r>
-        <w:rPr>
-          <w:rFonts w:ascii="Calibri" w:hAnsi="Calibri" w:cs="Calibri"/>
-          <w:b/>
-          <w:bCs/>
-        </w:rPr>
+          <w:color w:val="156082" w:themeColor="accent1"/>
+          <w:sz w:val="28"/>
+          <w:szCs w:val="28"/>
+        </w:rPr>
+      </w:pPr>
+      <w:r>
+        <w:rPr>
+          <w:rFonts w:ascii="Calibri" w:hAnsi="Calibri" w:cs="Calibri"/>
+          <w:b/>
+          <w:bCs/>
+          <w:color w:val="156082" w:themeColor="accent1"/>
+          <w:sz w:val="28"/>
+          <w:szCs w:val="28"/>
+        </w:rPr>
+        <w:lastRenderedPageBreak/>
         <w:t>JAVA</w:t>
       </w:r>
     </w:p>
@@ -1240,6 +1256,25 @@
           <w:rFonts w:ascii="Calibri" w:hAnsi="Calibri" w:cs="Calibri"/>
           <w:b/>
           <w:bCs/>
+          <w:color w:val="156082" w:themeColor="accent1"/>
+        </w:rPr>
+      </w:pPr>
+      <w:r>
+        <w:rPr>
+          <w:rFonts w:ascii="Calibri" w:hAnsi="Calibri" w:cs="Calibri"/>
+          <w:b/>
+          <w:bCs/>
+          <w:color w:val="156082" w:themeColor="accent1"/>
+        </w:rPr>
+        <w:t>PRINT STATEMENTS</w:t>
+      </w:r>
+    </w:p>
+    <w:p>
+      <w:pPr>
+        <w:rPr>
+          <w:rFonts w:ascii="Calibri" w:hAnsi="Calibri" w:cs="Calibri"/>
+          <w:b/>
+          <w:bCs/>
           <w:sz w:val="20"/>
           <w:szCs w:val="20"/>
         </w:rPr>
@@ -1252,66 +1287,9 @@
           <w:sz w:val="20"/>
           <w:szCs w:val="20"/>
         </w:rPr>
-        <w:t>Print statements:</w:t>
-      </w:r>
-    </w:p>
-    <w:p>
-      <w:pPr>
-        <w:rPr>
-          <w:rFonts w:ascii="Calibri" w:hAnsi="Calibri" w:cs="Calibri"/>
-          <w:b/>
-          <w:bCs/>
-          <w:sz w:val="28"/>
-          <w:szCs w:val="28"/>
-        </w:rPr>
-      </w:pPr>
-      <w:r>
-        <w:rPr>
-          <w:rFonts w:ascii="Calibri" w:hAnsi="Calibri" w:cs="Calibri"/>
-          <w:b/>
-          <w:bCs/>
-          <w:sz w:val="28"/>
-          <w:szCs w:val="28"/>
-        </w:rPr>
-        <w:drawing>
-          <wp:inline distT="0" distB="0" distL="0" distR="0" wp14:anchorId="096EC97C" wp14:editId="26975AAB">
-            <wp:extent cx="5731510" cy="3177540"/>
-            <wp:effectExtent l="0" t="0" r="2540" b="3810"/>
-            <wp:docPr id="923287899" name="Picture 1"/>
-            <wp:cNvGraphicFramePr>
-              <a:graphicFrameLocks xmlns:a="http://schemas.openxmlformats.org/drawingml/2006/main" noChangeAspect="1"/>
-            </wp:cNvGraphicFramePr>
-            <a:graphic xmlns:a="http://schemas.openxmlformats.org/drawingml/2006/main">
-              <a:graphicData uri="http://schemas.openxmlformats.org/drawingml/2006/picture">
-                <pic:pic xmlns:pic="http://schemas.openxmlformats.org/drawingml/2006/picture">
-                  <pic:nvPicPr>
-                    <pic:cNvPr id="923287899" name=""/>
-                    <pic:cNvPicPr/>
-                  </pic:nvPicPr>
-                  <pic:blipFill>
-                    <a:blip r:embed="rId24"/>
-                    <a:stretch>
-                      <a:fillRect/>
-                    </a:stretch>
-                  </pic:blipFill>
-                  <pic:spPr>
-                    <a:xfrm>
-                      <a:off x="0" y="0"/>
-                      <a:ext cx="5731510" cy="3177540"/>
-                    </a:xfrm>
-                    <a:prstGeom prst="rect">
-                      <a:avLst/>
-                    </a:prstGeom>
-                  </pic:spPr>
-                </pic:pic>
-              </a:graphicData>
-            </a:graphic>
-          </wp:inline>
-        </w:drawing>
-      </w:r>
-    </w:p>
-    <w:p>
-      <w:pPr>
+        <w:t>Ex</w:t>
+      </w:r>
+      <w:r>
         <w:rPr>
           <w:rFonts w:ascii="Calibri" w:hAnsi="Calibri" w:cs="Calibri"/>
           <w:b/>
@@ -1319,25 +1297,6 @@
           <w:sz w:val="20"/>
           <w:szCs w:val="20"/>
         </w:rPr>
-      </w:pPr>
-      <w:r>
-        <w:rPr>
-          <w:rFonts w:ascii="Calibri" w:hAnsi="Calibri" w:cs="Calibri"/>
-          <w:b/>
-          <w:bCs/>
-          <w:sz w:val="20"/>
-          <w:szCs w:val="20"/>
-        </w:rPr>
-        <w:t>Ex</w:t>
-      </w:r>
-      <w:r>
-        <w:rPr>
-          <w:rFonts w:ascii="Calibri" w:hAnsi="Calibri" w:cs="Calibri"/>
-          <w:b/>
-          <w:bCs/>
-          <w:sz w:val="20"/>
-          <w:szCs w:val="20"/>
-        </w:rPr>
         <w:t>ample:</w:t>
       </w:r>
     </w:p>
@@ -1355,25 +1314,7 @@
           <w:sz w:val="18"/>
           <w:szCs w:val="18"/>
         </w:rPr>
-        <w:t xml:space="preserve">public static void main(String[] </w:t>
-      </w:r>
-      <w:proofErr w:type="spellStart"/>
-      <w:r>
-        <w:rPr>
-          <w:rFonts w:ascii="Calibri" w:hAnsi="Calibri" w:cs="Calibri"/>
-          <w:sz w:val="18"/>
-          <w:szCs w:val="18"/>
-        </w:rPr>
-        <w:t>args</w:t>
-      </w:r>
-      <w:proofErr w:type="spellEnd"/>
-      <w:r>
-        <w:rPr>
-          <w:rFonts w:ascii="Calibri" w:hAnsi="Calibri" w:cs="Calibri"/>
-          <w:sz w:val="18"/>
-          <w:szCs w:val="18"/>
-        </w:rPr>
-        <w:t>) {</w:t>
+        <w:t>package JavaForRestassured;</w:t>
       </w:r>
       <w:r>
         <w:rPr>
@@ -1390,16 +1331,33 @@
           <w:szCs w:val="18"/>
         </w:rPr>
         <w:br/>
-        <w:t xml:space="preserve">    </w:t>
-      </w:r>
-      <w:proofErr w:type="spellStart"/>
-      <w:r>
-        <w:rPr>
-          <w:rFonts w:ascii="Calibri" w:hAnsi="Calibri" w:cs="Calibri"/>
-          <w:sz w:val="18"/>
-          <w:szCs w:val="18"/>
-        </w:rPr>
-        <w:t>System.</w:t>
+        <w:t>public class PrintStatement {</w:t>
+      </w:r>
+      <w:r>
+        <w:rPr>
+          <w:rFonts w:ascii="Calibri" w:hAnsi="Calibri" w:cs="Calibri"/>
+          <w:sz w:val="18"/>
+          <w:szCs w:val="18"/>
+        </w:rPr>
+        <w:br/>
+        <w:t xml:space="preserve">    public static void main(String[] args) {</w:t>
+      </w:r>
+      <w:r>
+        <w:rPr>
+          <w:rFonts w:ascii="Calibri" w:hAnsi="Calibri" w:cs="Calibri"/>
+          <w:sz w:val="18"/>
+          <w:szCs w:val="18"/>
+        </w:rPr>
+        <w:br/>
+      </w:r>
+      <w:r>
+        <w:rPr>
+          <w:rFonts w:ascii="Calibri" w:hAnsi="Calibri" w:cs="Calibri"/>
+          <w:sz w:val="18"/>
+          <w:szCs w:val="18"/>
+        </w:rPr>
+        <w:br/>
+        <w:t xml:space="preserve">        System.</w:t>
       </w:r>
       <w:r>
         <w:rPr>
@@ -1417,16 +1375,7 @@
           <w:sz w:val="18"/>
           <w:szCs w:val="18"/>
         </w:rPr>
-        <w:t>.println</w:t>
-      </w:r>
-      <w:proofErr w:type="spellEnd"/>
-      <w:r>
-        <w:rPr>
-          <w:rFonts w:ascii="Calibri" w:hAnsi="Calibri" w:cs="Calibri"/>
-          <w:sz w:val="18"/>
-          <w:szCs w:val="18"/>
-        </w:rPr>
-        <w:t>("Hello World !!");</w:t>
+        <w:t>.println("Hello World !!");</w:t>
       </w:r>
       <w:r>
         <w:rPr>
@@ -1435,16 +1384,7 @@
           <w:szCs w:val="18"/>
         </w:rPr>
         <w:br/>
-        <w:t xml:space="preserve">    </w:t>
-      </w:r>
-      <w:proofErr w:type="spellStart"/>
-      <w:r>
-        <w:rPr>
-          <w:rFonts w:ascii="Calibri" w:hAnsi="Calibri" w:cs="Calibri"/>
-          <w:sz w:val="18"/>
-          <w:szCs w:val="18"/>
-        </w:rPr>
-        <w:t>System.</w:t>
+        <w:t xml:space="preserve">        System.</w:t>
       </w:r>
       <w:r>
         <w:rPr>
@@ -1462,16 +1402,7 @@
           <w:sz w:val="18"/>
           <w:szCs w:val="18"/>
         </w:rPr>
-        <w:t>.println</w:t>
-      </w:r>
-      <w:proofErr w:type="spellEnd"/>
-      <w:r>
-        <w:rPr>
-          <w:rFonts w:ascii="Calibri" w:hAnsi="Calibri" w:cs="Calibri"/>
-          <w:sz w:val="18"/>
-          <w:szCs w:val="18"/>
-        </w:rPr>
-        <w:t>(555 + 888 - 222 * 6666);</w:t>
+        <w:t>.println(555 + 888 - 222 * 6666);</w:t>
       </w:r>
       <w:r>
         <w:rPr>
@@ -1488,7 +1419,7 @@
           <w:szCs w:val="18"/>
         </w:rPr>
         <w:br/>
-        <w:t xml:space="preserve">    </w:t>
+        <w:t xml:space="preserve">        </w:t>
       </w:r>
       <w:r>
         <w:rPr>
@@ -1509,9 +1440,8 @@
           <w:szCs w:val="18"/>
         </w:rPr>
         <w:br/>
-        <w:t xml:space="preserve">    </w:t>
-      </w:r>
-      <w:proofErr w:type="spellStart"/>
+        <w:t xml:space="preserve">        </w:t>
+      </w:r>
       <w:r>
         <w:rPr>
           <w:rFonts w:ascii="Calibri" w:hAnsi="Calibri" w:cs="Calibri"/>
@@ -1536,16 +1466,7 @@
           <w:sz w:val="18"/>
           <w:szCs w:val="18"/>
         </w:rPr>
-        <w:t>.println</w:t>
-      </w:r>
-      <w:proofErr w:type="spellEnd"/>
-      <w:r>
-        <w:rPr>
-          <w:rFonts w:ascii="Calibri" w:hAnsi="Calibri" w:cs="Calibri"/>
-          <w:sz w:val="18"/>
-          <w:szCs w:val="18"/>
-        </w:rPr>
-        <w:t xml:space="preserve">("Sum of " + 555 + 555);  </w:t>
+        <w:t xml:space="preserve">.println("Sum of " + 555 + 555);  </w:t>
       </w:r>
       <w:r>
         <w:rPr>
@@ -1566,9 +1487,8 @@
           <w:szCs w:val="18"/>
         </w:rPr>
         <w:br/>
-        <w:t xml:space="preserve">    </w:t>
-      </w:r>
-      <w:proofErr w:type="spellStart"/>
+        <w:t xml:space="preserve">        </w:t>
+      </w:r>
       <w:r>
         <w:rPr>
           <w:rFonts w:ascii="Calibri" w:hAnsi="Calibri" w:cs="Calibri"/>
@@ -1593,16 +1513,7 @@
           <w:sz w:val="18"/>
           <w:szCs w:val="18"/>
         </w:rPr>
-        <w:t>.println</w:t>
-      </w:r>
-      <w:proofErr w:type="spellEnd"/>
-      <w:r>
-        <w:rPr>
-          <w:rFonts w:ascii="Calibri" w:hAnsi="Calibri" w:cs="Calibri"/>
-          <w:sz w:val="18"/>
-          <w:szCs w:val="18"/>
-        </w:rPr>
-        <w:t xml:space="preserve">(555 + 555+" Sum is"); </w:t>
+        <w:t xml:space="preserve">.println(555 + 555+" Sum is"); </w:t>
       </w:r>
       <w:r>
         <w:rPr>
@@ -1623,9 +1534,8 @@
           <w:szCs w:val="18"/>
         </w:rPr>
         <w:br/>
-        <w:t xml:space="preserve">    </w:t>
-      </w:r>
-      <w:proofErr w:type="spellStart"/>
+        <w:t xml:space="preserve">        </w:t>
+      </w:r>
       <w:r>
         <w:rPr>
           <w:rFonts w:ascii="Calibri" w:hAnsi="Calibri" w:cs="Calibri"/>
@@ -1650,16 +1560,7 @@
           <w:sz w:val="18"/>
           <w:szCs w:val="18"/>
         </w:rPr>
-        <w:t>.println</w:t>
-      </w:r>
-      <w:proofErr w:type="spellEnd"/>
-      <w:r>
-        <w:rPr>
-          <w:rFonts w:ascii="Calibri" w:hAnsi="Calibri" w:cs="Calibri"/>
-          <w:sz w:val="18"/>
-          <w:szCs w:val="18"/>
-        </w:rPr>
-        <w:t xml:space="preserve">(555 + 555+" Sum is"+6666+666); </w:t>
+        <w:t xml:space="preserve">.println(555 + 555+" Sum is"+6666+666); </w:t>
       </w:r>
       <w:r>
         <w:rPr>
@@ -1690,9 +1591,8 @@
           <w:szCs w:val="18"/>
         </w:rPr>
         <w:br/>
-        <w:t xml:space="preserve">    </w:t>
-      </w:r>
-      <w:proofErr w:type="spellStart"/>
+        <w:t xml:space="preserve">        </w:t>
+      </w:r>
       <w:r>
         <w:rPr>
           <w:rFonts w:ascii="Calibri" w:hAnsi="Calibri" w:cs="Calibri"/>
@@ -1717,16 +1617,7 @@
           <w:sz w:val="18"/>
           <w:szCs w:val="18"/>
         </w:rPr>
-        <w:t>.println</w:t>
-      </w:r>
-      <w:proofErr w:type="spellEnd"/>
-      <w:r>
-        <w:rPr>
-          <w:rFonts w:ascii="Calibri" w:hAnsi="Calibri" w:cs="Calibri"/>
-          <w:sz w:val="18"/>
-          <w:szCs w:val="18"/>
-        </w:rPr>
-        <w:t xml:space="preserve">((555 + 555)+" Sum is"+(6666+666)); </w:t>
+        <w:t xml:space="preserve">.println((555 + 555)+" Sum is"+(6666+666)); </w:t>
       </w:r>
       <w:r>
         <w:rPr>
@@ -1757,13 +1648,248 @@
           <w:szCs w:val="18"/>
         </w:rPr>
         <w:br/>
-      </w:r>
-      <w:r>
-        <w:rPr>
-          <w:rFonts w:ascii="Calibri" w:hAnsi="Calibri" w:cs="Calibri"/>
-          <w:sz w:val="18"/>
-          <w:szCs w:val="18"/>
-        </w:rPr>
+        <w:t xml:space="preserve">        </w:t>
+      </w:r>
+      <w:r>
+        <w:rPr>
+          <w:rFonts w:ascii="Calibri" w:hAnsi="Calibri" w:cs="Calibri"/>
+          <w:sz w:val="18"/>
+          <w:szCs w:val="18"/>
+        </w:rPr>
+        <w:t>System.</w:t>
+      </w:r>
+      <w:r>
+        <w:rPr>
+          <w:rFonts w:ascii="Calibri" w:hAnsi="Calibri" w:cs="Calibri"/>
+          <w:i/>
+          <w:iCs/>
+          <w:sz w:val="18"/>
+          <w:szCs w:val="18"/>
+        </w:rPr>
+        <w:t>out</w:t>
+      </w:r>
+      <w:r>
+        <w:rPr>
+          <w:rFonts w:ascii="Calibri" w:hAnsi="Calibri" w:cs="Calibri"/>
+          <w:sz w:val="18"/>
+          <w:szCs w:val="18"/>
+        </w:rPr>
+        <w:t>.println('A'+10);</w:t>
+      </w:r>
+      <w:r>
+        <w:rPr>
+          <w:rFonts w:ascii="Calibri" w:hAnsi="Calibri" w:cs="Calibri"/>
+          <w:sz w:val="18"/>
+          <w:szCs w:val="18"/>
+        </w:rPr>
+        <w:br/>
+        <w:t xml:space="preserve">        System.</w:t>
+      </w:r>
+      <w:r>
+        <w:rPr>
+          <w:rFonts w:ascii="Calibri" w:hAnsi="Calibri" w:cs="Calibri"/>
+          <w:i/>
+          <w:iCs/>
+          <w:sz w:val="18"/>
+          <w:szCs w:val="18"/>
+        </w:rPr>
+        <w:t>out</w:t>
+      </w:r>
+      <w:r>
+        <w:rPr>
+          <w:rFonts w:ascii="Calibri" w:hAnsi="Calibri" w:cs="Calibri"/>
+          <w:sz w:val="18"/>
+          <w:szCs w:val="18"/>
+        </w:rPr>
+        <w:t>.println('A');</w:t>
+      </w:r>
+      <w:r>
+        <w:rPr>
+          <w:rFonts w:ascii="Calibri" w:hAnsi="Calibri" w:cs="Calibri"/>
+          <w:sz w:val="18"/>
+          <w:szCs w:val="18"/>
+        </w:rPr>
+        <w:br/>
+      </w:r>
+      <w:r>
+        <w:rPr>
+          <w:rFonts w:ascii="Calibri" w:hAnsi="Calibri" w:cs="Calibri"/>
+          <w:sz w:val="18"/>
+          <w:szCs w:val="18"/>
+        </w:rPr>
+        <w:br/>
+        <w:t xml:space="preserve">        </w:t>
+      </w:r>
+      <w:r>
+        <w:rPr>
+          <w:rFonts w:ascii="Calibri" w:hAnsi="Calibri" w:cs="Calibri"/>
+          <w:i/>
+          <w:iCs/>
+          <w:sz w:val="18"/>
+          <w:szCs w:val="18"/>
+        </w:rPr>
+        <w:t>//Char is converted to Ascii value and do operation and then concatenate with String</w:t>
+      </w:r>
+      <w:r>
+        <w:rPr>
+          <w:rFonts w:ascii="Calibri" w:hAnsi="Calibri" w:cs="Calibri"/>
+          <w:i/>
+          <w:iCs/>
+          <w:sz w:val="18"/>
+          <w:szCs w:val="18"/>
+        </w:rPr>
+        <w:br/>
+        <w:t xml:space="preserve">        </w:t>
+      </w:r>
+      <w:r>
+        <w:rPr>
+          <w:rFonts w:ascii="Calibri" w:hAnsi="Calibri" w:cs="Calibri"/>
+          <w:sz w:val="18"/>
+          <w:szCs w:val="18"/>
+        </w:rPr>
+        <w:t>System.</w:t>
+      </w:r>
+      <w:r>
+        <w:rPr>
+          <w:rFonts w:ascii="Calibri" w:hAnsi="Calibri" w:cs="Calibri"/>
+          <w:i/>
+          <w:iCs/>
+          <w:sz w:val="18"/>
+          <w:szCs w:val="18"/>
+        </w:rPr>
+        <w:t>out</w:t>
+      </w:r>
+      <w:r>
+        <w:rPr>
+          <w:rFonts w:ascii="Calibri" w:hAnsi="Calibri" w:cs="Calibri"/>
+          <w:sz w:val="18"/>
+          <w:szCs w:val="18"/>
+        </w:rPr>
+        <w:t>.println('A'+'B'+33+" Sum");</w:t>
+      </w:r>
+      <w:r>
+        <w:rPr>
+          <w:rFonts w:ascii="Calibri" w:hAnsi="Calibri" w:cs="Calibri"/>
+          <w:sz w:val="18"/>
+          <w:szCs w:val="18"/>
+        </w:rPr>
+        <w:br/>
+      </w:r>
+      <w:r>
+        <w:rPr>
+          <w:rFonts w:ascii="Calibri" w:hAnsi="Calibri" w:cs="Calibri"/>
+          <w:sz w:val="18"/>
+          <w:szCs w:val="18"/>
+        </w:rPr>
+        <w:br/>
+        <w:t xml:space="preserve">        </w:t>
+      </w:r>
+      <w:r>
+        <w:rPr>
+          <w:rFonts w:ascii="Calibri" w:hAnsi="Calibri" w:cs="Calibri"/>
+          <w:i/>
+          <w:iCs/>
+          <w:sz w:val="18"/>
+          <w:szCs w:val="18"/>
+        </w:rPr>
+        <w:t>//Executed as last statement</w:t>
+      </w:r>
+      <w:r>
+        <w:rPr>
+          <w:rFonts w:ascii="Calibri" w:hAnsi="Calibri" w:cs="Calibri"/>
+          <w:i/>
+          <w:iCs/>
+          <w:sz w:val="18"/>
+          <w:szCs w:val="18"/>
+        </w:rPr>
+        <w:br/>
+        <w:t xml:space="preserve">        </w:t>
+      </w:r>
+      <w:r>
+        <w:rPr>
+          <w:rFonts w:ascii="Calibri" w:hAnsi="Calibri" w:cs="Calibri"/>
+          <w:sz w:val="18"/>
+          <w:szCs w:val="18"/>
+        </w:rPr>
+        <w:t>System.</w:t>
+      </w:r>
+      <w:r>
+        <w:rPr>
+          <w:rFonts w:ascii="Calibri" w:hAnsi="Calibri" w:cs="Calibri"/>
+          <w:i/>
+          <w:iCs/>
+          <w:sz w:val="18"/>
+          <w:szCs w:val="18"/>
+        </w:rPr>
+        <w:t>err</w:t>
+      </w:r>
+      <w:r>
+        <w:rPr>
+          <w:rFonts w:ascii="Calibri" w:hAnsi="Calibri" w:cs="Calibri"/>
+          <w:sz w:val="18"/>
+          <w:szCs w:val="18"/>
+        </w:rPr>
+        <w:t>.println("Error Message");</w:t>
+      </w:r>
+      <w:r>
+        <w:rPr>
+          <w:rFonts w:ascii="Calibri" w:hAnsi="Calibri" w:cs="Calibri"/>
+          <w:sz w:val="18"/>
+          <w:szCs w:val="18"/>
+        </w:rPr>
+        <w:br/>
+      </w:r>
+      <w:r>
+        <w:rPr>
+          <w:rFonts w:ascii="Calibri" w:hAnsi="Calibri" w:cs="Calibri"/>
+          <w:sz w:val="18"/>
+          <w:szCs w:val="18"/>
+        </w:rPr>
+        <w:br/>
+        <w:t xml:space="preserve">        System.</w:t>
+      </w:r>
+      <w:r>
+        <w:rPr>
+          <w:rFonts w:ascii="Calibri" w:hAnsi="Calibri" w:cs="Calibri"/>
+          <w:i/>
+          <w:iCs/>
+          <w:sz w:val="18"/>
+          <w:szCs w:val="18"/>
+        </w:rPr>
+        <w:t>out</w:t>
+      </w:r>
+      <w:r>
+        <w:rPr>
+          <w:rFonts w:ascii="Calibri" w:hAnsi="Calibri" w:cs="Calibri"/>
+          <w:sz w:val="18"/>
+          <w:szCs w:val="18"/>
+        </w:rPr>
+        <w:t>.println("Hello Worlds");</w:t>
+      </w:r>
+      <w:r>
+        <w:rPr>
+          <w:rFonts w:ascii="Calibri" w:hAnsi="Calibri" w:cs="Calibri"/>
+          <w:sz w:val="18"/>
+          <w:szCs w:val="18"/>
+        </w:rPr>
+        <w:br/>
+      </w:r>
+      <w:r>
+        <w:rPr>
+          <w:rFonts w:ascii="Calibri" w:hAnsi="Calibri" w:cs="Calibri"/>
+          <w:sz w:val="18"/>
+          <w:szCs w:val="18"/>
+        </w:rPr>
+        <w:br/>
+        <w:t xml:space="preserve">    }</w:t>
+      </w:r>
+      <w:r>
+        <w:rPr>
+          <w:rFonts w:ascii="Calibri" w:hAnsi="Calibri" w:cs="Calibri"/>
+          <w:sz w:val="18"/>
+          <w:szCs w:val="18"/>
+        </w:rPr>
+        <w:br/>
         <w:t>}</w:t>
       </w:r>
     </w:p>
@@ -1771,12 +1897,262 @@
       <w:pPr>
         <w:rPr>
           <w:rFonts w:ascii="Calibri" w:hAnsi="Calibri" w:cs="Calibri"/>
-          <w:b/>
-          <w:bCs/>
-          <w:sz w:val="28"/>
-          <w:szCs w:val="28"/>
-        </w:rPr>
-      </w:pPr>
+          <w:sz w:val="18"/>
+          <w:szCs w:val="18"/>
+        </w:rPr>
+      </w:pPr>
+      <w:r>
+        <w:rPr>
+          <w:rFonts w:ascii="Calibri" w:hAnsi="Calibri" w:cs="Calibri"/>
+          <w:sz w:val="18"/>
+          <w:szCs w:val="18"/>
+        </w:rPr>
+        <w:t>OUTPUT:</w:t>
+      </w:r>
+    </w:p>
+    <w:p>
+      <w:pPr>
+        <w:rPr>
+          <w:rFonts w:ascii="Calibri" w:hAnsi="Calibri" w:cs="Calibri"/>
+          <w:sz w:val="18"/>
+          <w:szCs w:val="18"/>
+        </w:rPr>
+      </w:pPr>
+      <w:r>
+        <w:rPr>
+          <w:rFonts w:ascii="Calibri" w:hAnsi="Calibri" w:cs="Calibri"/>
+          <w:sz w:val="18"/>
+          <w:szCs w:val="18"/>
+        </w:rPr>
+        <w:t>Hello World !!</w:t>
+      </w:r>
+    </w:p>
+    <w:p>
+      <w:pPr>
+        <w:rPr>
+          <w:rFonts w:ascii="Calibri" w:hAnsi="Calibri" w:cs="Calibri"/>
+          <w:sz w:val="18"/>
+          <w:szCs w:val="18"/>
+        </w:rPr>
+      </w:pPr>
+      <w:r>
+        <w:rPr>
+          <w:rFonts w:ascii="Calibri" w:hAnsi="Calibri" w:cs="Calibri"/>
+          <w:sz w:val="18"/>
+          <w:szCs w:val="18"/>
+        </w:rPr>
+        <w:t>-1478409</w:t>
+      </w:r>
+    </w:p>
+    <w:p>
+      <w:pPr>
+        <w:rPr>
+          <w:rFonts w:ascii="Calibri" w:hAnsi="Calibri" w:cs="Calibri"/>
+          <w:sz w:val="18"/>
+          <w:szCs w:val="18"/>
+        </w:rPr>
+      </w:pPr>
+      <w:r>
+        <w:rPr>
+          <w:rFonts w:ascii="Calibri" w:hAnsi="Calibri" w:cs="Calibri"/>
+          <w:sz w:val="18"/>
+          <w:szCs w:val="18"/>
+        </w:rPr>
+        <w:t>Sum of 555555</w:t>
+      </w:r>
+    </w:p>
+    <w:p>
+      <w:pPr>
+        <w:rPr>
+          <w:rFonts w:ascii="Calibri" w:hAnsi="Calibri" w:cs="Calibri"/>
+          <w:sz w:val="18"/>
+          <w:szCs w:val="18"/>
+        </w:rPr>
+      </w:pPr>
+      <w:r>
+        <w:rPr>
+          <w:rFonts w:ascii="Calibri" w:hAnsi="Calibri" w:cs="Calibri"/>
+          <w:sz w:val="18"/>
+          <w:szCs w:val="18"/>
+        </w:rPr>
+        <w:t>1110 Sum is</w:t>
+      </w:r>
+    </w:p>
+    <w:p>
+      <w:pPr>
+        <w:rPr>
+          <w:rFonts w:ascii="Calibri" w:hAnsi="Calibri" w:cs="Calibri"/>
+          <w:sz w:val="18"/>
+          <w:szCs w:val="18"/>
+        </w:rPr>
+      </w:pPr>
+      <w:r>
+        <w:rPr>
+          <w:rFonts w:ascii="Calibri" w:hAnsi="Calibri" w:cs="Calibri"/>
+          <w:sz w:val="18"/>
+          <w:szCs w:val="18"/>
+        </w:rPr>
+        <w:t>1110 Sum is6666666</w:t>
+      </w:r>
+    </w:p>
+    <w:p>
+      <w:pPr>
+        <w:rPr>
+          <w:rFonts w:ascii="Calibri" w:hAnsi="Calibri" w:cs="Calibri"/>
+          <w:sz w:val="18"/>
+          <w:szCs w:val="18"/>
+        </w:rPr>
+      </w:pPr>
+      <w:r>
+        <w:rPr>
+          <w:rFonts w:ascii="Calibri" w:hAnsi="Calibri" w:cs="Calibri"/>
+          <w:sz w:val="18"/>
+          <w:szCs w:val="18"/>
+        </w:rPr>
+        <w:t>1110 Sum is7332</w:t>
+      </w:r>
+    </w:p>
+    <w:p>
+      <w:pPr>
+        <w:rPr>
+          <w:rFonts w:ascii="Calibri" w:hAnsi="Calibri" w:cs="Calibri"/>
+          <w:sz w:val="18"/>
+          <w:szCs w:val="18"/>
+        </w:rPr>
+      </w:pPr>
+      <w:r>
+        <w:rPr>
+          <w:rFonts w:ascii="Calibri" w:hAnsi="Calibri" w:cs="Calibri"/>
+          <w:sz w:val="18"/>
+          <w:szCs w:val="18"/>
+        </w:rPr>
+        <w:t>75</w:t>
+      </w:r>
+    </w:p>
+    <w:p>
+      <w:pPr>
+        <w:rPr>
+          <w:rFonts w:ascii="Calibri" w:hAnsi="Calibri" w:cs="Calibri"/>
+          <w:sz w:val="18"/>
+          <w:szCs w:val="18"/>
+        </w:rPr>
+      </w:pPr>
+      <w:r>
+        <w:rPr>
+          <w:rFonts w:ascii="Calibri" w:hAnsi="Calibri" w:cs="Calibri"/>
+          <w:sz w:val="18"/>
+          <w:szCs w:val="18"/>
+        </w:rPr>
+        <w:t>A</w:t>
+      </w:r>
+    </w:p>
+    <w:p>
+      <w:pPr>
+        <w:rPr>
+          <w:rFonts w:ascii="Calibri" w:hAnsi="Calibri" w:cs="Calibri"/>
+          <w:sz w:val="18"/>
+          <w:szCs w:val="18"/>
+        </w:rPr>
+      </w:pPr>
+      <w:r>
+        <w:rPr>
+          <w:rFonts w:ascii="Calibri" w:hAnsi="Calibri" w:cs="Calibri"/>
+          <w:sz w:val="18"/>
+          <w:szCs w:val="18"/>
+        </w:rPr>
+        <w:t>164 Sum</w:t>
+      </w:r>
+    </w:p>
+    <w:p>
+      <w:pPr>
+        <w:rPr>
+          <w:rFonts w:ascii="Calibri" w:hAnsi="Calibri" w:cs="Calibri"/>
+          <w:sz w:val="18"/>
+          <w:szCs w:val="18"/>
+        </w:rPr>
+      </w:pPr>
+      <w:r>
+        <w:rPr>
+          <w:rFonts w:ascii="Calibri" w:hAnsi="Calibri" w:cs="Calibri"/>
+          <w:sz w:val="18"/>
+          <w:szCs w:val="18"/>
+        </w:rPr>
+        <w:t>Hello Worlds</w:t>
+      </w:r>
+    </w:p>
+    <w:p>
+      <w:pPr>
+        <w:rPr>
+          <w:rFonts w:ascii="Calibri" w:hAnsi="Calibri" w:cs="Calibri"/>
+          <w:sz w:val="18"/>
+          <w:szCs w:val="18"/>
+        </w:rPr>
+      </w:pPr>
+      <w:r>
+        <w:rPr>
+          <w:rFonts w:ascii="Calibri" w:hAnsi="Calibri" w:cs="Calibri"/>
+          <w:sz w:val="18"/>
+          <w:szCs w:val="18"/>
+        </w:rPr>
+        <w:t>Error Message</w:t>
+      </w:r>
+    </w:p>
+    <w:p>
+      <w:pPr>
+        <w:rPr>
+          <w:rFonts w:ascii="Calibri" w:hAnsi="Calibri" w:cs="Calibri"/>
+          <w:sz w:val="18"/>
+          <w:szCs w:val="18"/>
+        </w:rPr>
+      </w:pPr>
+    </w:p>
+    <w:p>
+      <w:pPr>
+        <w:pStyle w:val="ListParagraph"/>
+        <w:numPr>
+          <w:ilvl w:val="0"/>
+          <w:numId w:val="1"/>
+        </w:numPr>
+        <w:rPr>
+          <w:rFonts w:ascii="Calibri" w:hAnsi="Calibri" w:cs="Calibri"/>
+          <w:b/>
+          <w:bCs/>
+          <w:color w:val="156082" w:themeColor="accent1"/>
+        </w:rPr>
+      </w:pPr>
+      <w:r>
+        <w:rPr>
+          <w:rFonts w:ascii="Calibri" w:hAnsi="Calibri" w:cs="Calibri"/>
+          <w:b/>
+          <w:bCs/>
+          <w:color w:val="156082" w:themeColor="accent1"/>
+        </w:rPr>
+        <w:t>VARIABLES AND DATA TYPES</w:t>
+      </w:r>
+    </w:p>
+    <w:p>
+      <w:pPr>
+        <w:pStyle w:val="ListParagraph"/>
+        <w:numPr>
+          <w:ilvl w:val="0"/>
+          <w:numId w:val="1"/>
+        </w:numPr>
+        <w:rPr>
+          <w:rFonts w:ascii="Calibri" w:hAnsi="Calibri" w:cs="Calibri"/>
+          <w:b/>
+          <w:bCs/>
+          <w:color w:val="156082" w:themeColor="accent1"/>
+        </w:rPr>
+      </w:pPr>
+      <w:r>
+        <w:rPr>
+          <w:rFonts w:ascii="Calibri" w:hAnsi="Calibri" w:cs="Calibri"/>
+          <w:b/>
+          <w:bCs/>
+          <w:color w:val="156082" w:themeColor="accent1"/>
+        </w:rPr>
+        <w:t>STRINGS</w:t>
+      </w:r>
     </w:p>
     <w:p>
       <w:pPr>
@@ -1804,8 +2180,8 @@
   <w:abstractNum w:abstractNumId="0" w15:restartNumberingAfterBreak="0">
     <w:nsid w:val="0F31040F"/>
     <w:multiLevelType w:val="hybridMultilevel"/>
-    <w:tmpl w:val="F6583294"/>
-    <w:lvl w:ilvl="0" w:tplc="D61225F8">
+    <w:tmpl w:val="6164AA4E"/>
+    <w:lvl w:ilvl="0" w:tplc="04184898">
       <w:start w:val="1"/>
       <w:numFmt w:val="decimal"/>
       <w:lvlText w:val="%1."/>
@@ -1815,8 +2191,8 @@
       </w:pPr>
       <w:rPr>
         <w:rFonts w:hint="default"/>
-        <w:sz w:val="18"/>
-        <w:szCs w:val="18"/>
+        <w:sz w:val="24"/>
+        <w:szCs w:val="24"/>
       </w:rPr>
     </w:lvl>
     <w:lvl w:ilvl="1" w:tplc="40090019" w:tentative="1">
@@ -2837,6 +3213,17 @@
       <w:shd w:val="clear" w:color="auto" w:fill="E1DFDD"/>
     </w:rPr>
   </w:style>
+  <w:style w:type="paragraph" w:styleId="NormalWeb">
+    <w:name w:val="Normal (Web)"/>
+    <w:basedOn w:val="Normal"/>
+    <w:uiPriority w:val="99"/>
+    <w:semiHidden/>
+    <w:unhideWhenUsed/>
+    <w:rsid w:val="005F162E"/>
+    <w:rPr>
+      <w:rFonts w:ascii="Times New Roman" w:hAnsi="Times New Roman" w:cs="Times New Roman"/>
+    </w:rPr>
+  </w:style>
 </w:styles>
 </file>
 

</xml_diff>